<commit_message>
Adding comments everywhere timestep scaling is used.
</commit_message>
<xml_diff>
--- a/docs/Build Documentation.docx
+++ b/docs/Build Documentation.docx
@@ -133,24 +133,14 @@
       <w:r>
         <w:t xml:space="preserve">Figure </w:t>
       </w:r>
-      <w:r>
-        <w:fldChar w:fldCharType="begin"/>
-      </w:r>
-      <w:r>
-        <w:instrText xml:space="preserve"> SEQ Figure \* ARABIC </w:instrText>
-      </w:r>
-      <w:r>
-        <w:fldChar w:fldCharType="separate"/>
-      </w:r>
-      <w:r>
-        <w:rPr>
-          <w:noProof/>
-        </w:rPr>
-        <w:t>1</w:t>
-      </w:r>
-      <w:r>
-        <w:fldChar w:fldCharType="end"/>
-      </w:r>
+      <w:fldSimple w:instr=" SEQ Figure \* ARABIC ">
+        <w:r>
+          <w:rPr>
+            <w:noProof/>
+          </w:rPr>
+          <w:t>1</w:t>
+        </w:r>
+      </w:fldSimple>
       <w:bookmarkEnd w:id="0"/>
       <w:r>
         <w:t xml:space="preserve"> the compartment model</w:t>
@@ -361,24 +351,14 @@
       <w:r>
         <w:t xml:space="preserve">Figure </w:t>
       </w:r>
-      <w:r>
-        <w:fldChar w:fldCharType="begin"/>
-      </w:r>
-      <w:r>
-        <w:instrText xml:space="preserve"> SEQ Figure \* ARABIC </w:instrText>
-      </w:r>
-      <w:r>
-        <w:fldChar w:fldCharType="separate"/>
-      </w:r>
-      <w:r>
-        <w:rPr>
-          <w:noProof/>
-        </w:rPr>
-        <w:t>2</w:t>
-      </w:r>
-      <w:r>
-        <w:fldChar w:fldCharType="end"/>
-      </w:r>
+      <w:fldSimple w:instr=" SEQ Figure \* ARABIC ">
+        <w:r>
+          <w:rPr>
+            <w:noProof/>
+          </w:rPr>
+          <w:t>2</w:t>
+        </w:r>
+      </w:fldSimple>
       <w:bookmarkEnd w:id="2"/>
       <w:r>
         <w:t xml:space="preserve"> Contacts.csv</w:t>
@@ -569,34 +549,24 @@
         <w:pStyle w:val="Caption"/>
         <w:jc w:val="center"/>
       </w:pPr>
-      <w:bookmarkStart w:id="3" w:name="_Ref41478881"/>
-      <w:bookmarkStart w:id="4" w:name="_Ref41478904"/>
+      <w:bookmarkStart w:id="3" w:name="_Ref41478904"/>
+      <w:bookmarkStart w:id="4" w:name="_Ref41478881"/>
       <w:r>
         <w:t xml:space="preserve">Figure </w:t>
       </w:r>
-      <w:r>
-        <w:fldChar w:fldCharType="begin"/>
-      </w:r>
-      <w:r>
-        <w:instrText xml:space="preserve"> SEQ Figure \* ARABIC </w:instrText>
-      </w:r>
-      <w:r>
-        <w:fldChar w:fldCharType="separate"/>
-      </w:r>
-      <w:r>
-        <w:rPr>
-          <w:noProof/>
-        </w:rPr>
-        <w:t>3</w:t>
-      </w:r>
-      <w:r>
-        <w:fldChar w:fldCharType="end"/>
+      <w:fldSimple w:instr=" SEQ Figure \* ARABIC ">
+        <w:r>
+          <w:rPr>
+            <w:noProof/>
+          </w:rPr>
+          <w:t>3</w:t>
+        </w:r>
+      </w:fldSimple>
+      <w:bookmarkEnd w:id="3"/>
+      <w:r>
+        <w:t xml:space="preserve"> the diseaseSettings.json file</w:t>
       </w:r>
       <w:bookmarkEnd w:id="4"/>
-      <w:r>
-        <w:t xml:space="preserve"> the diseaseSettings.json file</w:t>
-      </w:r>
-      <w:bookmarkEnd w:id="3"/>
     </w:p>
     <w:p/>
     <w:p>
@@ -727,24 +697,14 @@
       <w:r>
         <w:t xml:space="preserve">Figure </w:t>
       </w:r>
-      <w:r>
-        <w:fldChar w:fldCharType="begin"/>
-      </w:r>
-      <w:r>
-        <w:instrText xml:space="preserve"> SEQ Figure \* ARABIC </w:instrText>
-      </w:r>
-      <w:r>
-        <w:fldChar w:fldCharType="separate"/>
-      </w:r>
-      <w:r>
-        <w:rPr>
-          <w:noProof/>
-        </w:rPr>
-        <w:t>4</w:t>
-      </w:r>
-      <w:r>
-        <w:fldChar w:fldCharType="end"/>
-      </w:r>
+      <w:fldSimple w:instr=" SEQ Figure \* ARABIC ">
+        <w:r>
+          <w:rPr>
+            <w:noProof/>
+          </w:rPr>
+          <w:t>4</w:t>
+        </w:r>
+      </w:fldSimple>
       <w:bookmarkEnd w:id="5"/>
       <w:r>
         <w:t xml:space="preserve"> the population input</w:t>
@@ -866,24 +826,14 @@
       <w:r>
         <w:t xml:space="preserve">Figure </w:t>
       </w:r>
-      <w:r>
-        <w:fldChar w:fldCharType="begin"/>
-      </w:r>
-      <w:r>
-        <w:instrText xml:space="preserve"> SEQ Figure \* ARABIC </w:instrText>
-      </w:r>
-      <w:r>
-        <w:fldChar w:fldCharType="separate"/>
-      </w:r>
-      <w:r>
-        <w:rPr>
-          <w:noProof/>
-        </w:rPr>
-        <w:t>5</w:t>
-      </w:r>
-      <w:r>
-        <w:fldChar w:fldCharType="end"/>
-      </w:r>
+      <w:fldSimple w:instr=" SEQ Figure \* ARABIC ">
+        <w:r>
+          <w:rPr>
+            <w:noProof/>
+          </w:rPr>
+          <w:t>5</w:t>
+        </w:r>
+      </w:fldSimple>
       <w:r>
         <w:t xml:space="preserve"> the run settings file</w:t>
       </w:r>
@@ -1235,24 +1185,14 @@
       <w:r>
         <w:t xml:space="preserve">Figure </w:t>
       </w:r>
-      <w:r>
-        <w:fldChar w:fldCharType="begin"/>
-      </w:r>
-      <w:r>
-        <w:instrText xml:space="preserve"> SEQ Figure \* ARABIC </w:instrText>
-      </w:r>
-      <w:r>
-        <w:fldChar w:fldCharType="separate"/>
-      </w:r>
-      <w:r>
-        <w:rPr>
-          <w:noProof/>
-        </w:rPr>
-        <w:t>6</w:t>
-      </w:r>
-      <w:r>
-        <w:fldChar w:fldCharType="end"/>
-      </w:r>
+      <w:fldSimple w:instr=" SEQ Figure \* ARABIC ">
+        <w:r>
+          <w:rPr>
+            <w:noProof/>
+          </w:rPr>
+          <w:t>6</w:t>
+        </w:r>
+      </w:fldSimple>
       <w:bookmarkEnd w:id="6"/>
       <w:r>
         <w:t xml:space="preserve"> the alert status transitions</w:t>
@@ -1370,24 +1310,14 @@
       <w:r>
         <w:t xml:space="preserve">Figure </w:t>
       </w:r>
-      <w:r>
-        <w:fldChar w:fldCharType="begin"/>
-      </w:r>
-      <w:r>
-        <w:instrText xml:space="preserve"> SEQ Figure \* ARABIC </w:instrText>
-      </w:r>
-      <w:r>
-        <w:fldChar w:fldCharType="separate"/>
-      </w:r>
-      <w:r>
-        <w:rPr>
-          <w:noProof/>
-        </w:rPr>
-        <w:t>7</w:t>
-      </w:r>
-      <w:r>
-        <w:fldChar w:fldCharType="end"/>
-      </w:r>
+      <w:fldSimple w:instr=" SEQ Figure \* ARABIC ">
+        <w:r>
+          <w:rPr>
+            <w:noProof/>
+          </w:rPr>
+          <w:t>7</w:t>
+        </w:r>
+      </w:fldSimple>
       <w:bookmarkEnd w:id="7"/>
       <w:r>
         <w:t xml:space="preserve"> Project and Package Layout</w:t>
@@ -1506,24 +1436,14 @@
       <w:r>
         <w:t xml:space="preserve">Figure </w:t>
       </w:r>
-      <w:r>
-        <w:fldChar w:fldCharType="begin"/>
-      </w:r>
-      <w:r>
-        <w:instrText xml:space="preserve"> SEQ Figure \* ARABIC </w:instrText>
-      </w:r>
-      <w:r>
-        <w:fldChar w:fldCharType="separate"/>
-      </w:r>
-      <w:r>
-        <w:rPr>
-          <w:noProof/>
-        </w:rPr>
-        <w:t>8</w:t>
-      </w:r>
-      <w:r>
-        <w:fldChar w:fldCharType="end"/>
-      </w:r>
+      <w:fldSimple w:instr=" SEQ Figure \* ARABIC ">
+        <w:r>
+          <w:rPr>
+            <w:noProof/>
+          </w:rPr>
+          <w:t>8</w:t>
+        </w:r>
+      </w:fldSimple>
       <w:bookmarkEnd w:id="8"/>
       <w:r>
         <w:t xml:space="preserve"> The top-level execution structure</w:t>
@@ -1927,24 +1847,14 @@
       <w:r>
         <w:t xml:space="preserve">Table </w:t>
       </w:r>
-      <w:r>
-        <w:fldChar w:fldCharType="begin"/>
-      </w:r>
-      <w:r>
-        <w:instrText xml:space="preserve"> SEQ Table \* ARABIC </w:instrText>
-      </w:r>
-      <w:r>
-        <w:fldChar w:fldCharType="separate"/>
-      </w:r>
-      <w:r>
-        <w:rPr>
-          <w:noProof/>
-        </w:rPr>
-        <w:t>1</w:t>
-      </w:r>
-      <w:r>
-        <w:fldChar w:fldCharType="end"/>
-      </w:r>
+      <w:fldSimple w:instr=" SEQ Table \* ARABIC ">
+        <w:r>
+          <w:rPr>
+            <w:noProof/>
+          </w:rPr>
+          <w:t>1</w:t>
+        </w:r>
+      </w:fldSimple>
       <w:bookmarkEnd w:id="9"/>
       <w:r>
         <w:rPr>
@@ -2244,24 +2154,14 @@
       <w:r>
         <w:t xml:space="preserve">Equation </w:t>
       </w:r>
-      <w:r>
-        <w:fldChar w:fldCharType="begin"/>
-      </w:r>
-      <w:r>
-        <w:instrText xml:space="preserve"> SEQ Equation \* ARABIC </w:instrText>
-      </w:r>
-      <w:r>
-        <w:fldChar w:fldCharType="separate"/>
-      </w:r>
-      <w:r>
-        <w:rPr>
-          <w:noProof/>
-        </w:rPr>
-        <w:t>1</w:t>
-      </w:r>
-      <w:r>
-        <w:fldChar w:fldCharType="end"/>
-      </w:r>
+      <w:fldSimple w:instr=" SEQ Equation \* ARABIC ">
+        <w:r>
+          <w:rPr>
+            <w:noProof/>
+          </w:rPr>
+          <w:t>1</w:t>
+        </w:r>
+      </w:fldSimple>
       <w:r>
         <w:rPr>
           <w:noProof/>
@@ -2649,24 +2549,14 @@
       <w:r>
         <w:t xml:space="preserve">Equation </w:t>
       </w:r>
-      <w:r>
-        <w:fldChar w:fldCharType="begin"/>
-      </w:r>
-      <w:r>
-        <w:instrText xml:space="preserve"> SEQ Equation \* ARABIC </w:instrText>
-      </w:r>
-      <w:r>
-        <w:fldChar w:fldCharType="separate"/>
-      </w:r>
-      <w:r>
-        <w:rPr>
-          <w:noProof/>
-        </w:rPr>
-        <w:t>2</w:t>
-      </w:r>
-      <w:r>
-        <w:fldChar w:fldCharType="end"/>
-      </w:r>
+      <w:fldSimple w:instr=" SEQ Equation \* ARABIC ">
+        <w:r>
+          <w:rPr>
+            <w:noProof/>
+          </w:rPr>
+          <w:t>2</w:t>
+        </w:r>
+      </w:fldSimple>
       <w:r>
         <w:t xml:space="preserve"> how gender is calculated</w:t>
       </w:r>
@@ -2783,12 +2673,7 @@
     </w:p>
     <w:p>
       <w:r>
-        <w:t xml:space="preserve">The compartment data is returned from the outbreak.propagate() method. </w:t>
-      </w:r>
-      <w:bookmarkStart w:id="11" w:name="_GoBack"/>
-      <w:bookmarkEnd w:id="11"/>
-      <w:r>
-        <w:t xml:space="preserve">This is sent to a writer which outputs a CSV file. </w:t>
+        <w:t xml:space="preserve">The compartment data is returned from the outbreak.propagate() method. This is sent to a writer which outputs a CSV file. </w:t>
       </w:r>
       <w:r>
         <w:t xml:space="preserve">An example is shown in </w:t>
@@ -2875,29 +2760,19 @@
         <w:pStyle w:val="Caption"/>
         <w:jc w:val="center"/>
       </w:pPr>
-      <w:bookmarkStart w:id="12" w:name="_Ref41478163"/>
+      <w:bookmarkStart w:id="11" w:name="_Ref41478163"/>
       <w:r>
         <w:t xml:space="preserve">Figure </w:t>
       </w:r>
-      <w:r>
-        <w:fldChar w:fldCharType="begin"/>
-      </w:r>
-      <w:r>
-        <w:instrText xml:space="preserve"> SEQ Figure \* ARABIC </w:instrText>
-      </w:r>
-      <w:r>
-        <w:fldChar w:fldCharType="separate"/>
-      </w:r>
-      <w:r>
-        <w:rPr>
-          <w:noProof/>
-        </w:rPr>
-        <w:t>9</w:t>
-      </w:r>
-      <w:r>
-        <w:fldChar w:fldCharType="end"/>
-      </w:r>
-      <w:bookmarkEnd w:id="12"/>
+      <w:fldSimple w:instr=" SEQ Figure \* ARABIC ">
+        <w:r>
+          <w:rPr>
+            <w:noProof/>
+          </w:rPr>
+          <w:t>9</w:t>
+        </w:r>
+      </w:fldSimple>
+      <w:bookmarkEnd w:id="11"/>
       <w:r>
         <w:t xml:space="preserve"> example of CSV output</w:t>
       </w:r>
@@ -3089,29 +2964,19 @@
         <w:pStyle w:val="Caption"/>
         <w:jc w:val="center"/>
       </w:pPr>
-      <w:bookmarkStart w:id="13" w:name="_Ref41493318"/>
+      <w:bookmarkStart w:id="12" w:name="_Ref41493318"/>
       <w:r>
         <w:t xml:space="preserve">Figure </w:t>
       </w:r>
-      <w:r>
-        <w:fldChar w:fldCharType="begin"/>
-      </w:r>
-      <w:r>
-        <w:instrText xml:space="preserve"> SEQ Figure \* ARABIC </w:instrText>
-      </w:r>
-      <w:r>
-        <w:fldChar w:fldCharType="separate"/>
-      </w:r>
-      <w:r>
-        <w:rPr>
-          <w:noProof/>
-        </w:rPr>
-        <w:t>10</w:t>
-      </w:r>
-      <w:r>
-        <w:fldChar w:fldCharType="end"/>
-      </w:r>
-      <w:bookmarkEnd w:id="13"/>
+      <w:fldSimple w:instr=" SEQ Figure \* ARABIC ">
+        <w:r>
+          <w:rPr>
+            <w:noProof/>
+          </w:rPr>
+          <w:t>10</w:t>
+        </w:r>
+      </w:fldSimple>
+      <w:bookmarkEnd w:id="12"/>
       <w:r>
         <w:t xml:space="preserve"> The propagation routine</w:t>
       </w:r>
@@ -3266,29 +3131,19 @@
         <w:pStyle w:val="Caption"/>
         <w:jc w:val="center"/>
       </w:pPr>
-      <w:bookmarkStart w:id="14" w:name="_Ref41494678"/>
+      <w:bookmarkStart w:id="13" w:name="_Ref41494678"/>
       <w:r>
         <w:t xml:space="preserve">Figure </w:t>
       </w:r>
-      <w:r>
-        <w:fldChar w:fldCharType="begin"/>
-      </w:r>
-      <w:r>
-        <w:instrText xml:space="preserve"> SEQ Figure \* ARABIC </w:instrText>
-      </w:r>
-      <w:r>
-        <w:fldChar w:fldCharType="separate"/>
-      </w:r>
-      <w:r>
-        <w:rPr>
-          <w:noProof/>
-        </w:rPr>
-        <w:t>11</w:t>
-      </w:r>
-      <w:r>
-        <w:fldChar w:fldCharType="end"/>
-      </w:r>
-      <w:bookmarkEnd w:id="14"/>
+      <w:fldSimple w:instr=" SEQ Figure \* ARABIC ">
+        <w:r>
+          <w:rPr>
+            <w:noProof/>
+          </w:rPr>
+          <w:t>11</w:t>
+        </w:r>
+      </w:fldSimple>
+      <w:bookmarkEnd w:id="13"/>
       <w:r>
         <w:t xml:space="preserve"> infection map example</w:t>
       </w:r>
@@ -3302,394 +3157,50 @@
           <w:numId w:val="1"/>
         </w:numPr>
       </w:pPr>
-      <w:bookmarkStart w:id="15" w:name="_Ref41493983"/>
+      <w:bookmarkStart w:id="14" w:name="_Ref41493983"/>
       <w:r>
         <w:t>Run Contact Data</w:t>
       </w:r>
-      <w:bookmarkEnd w:id="15"/>
-    </w:p>
-    <w:p/>
-    <w:p>
-      <w:r>
-        <w:t xml:space="preserve">Running the propagation of infection is the heart of the calculation. </w:t>
-      </w:r>
-      <w:r>
-        <w:fldChar w:fldCharType="begin"/>
-      </w:r>
-      <w:r>
-        <w:instrText xml:space="preserve"> REF _Ref41497488 \h </w:instrText>
-      </w:r>
-      <w:r>
-        <w:fldChar w:fldCharType="separate"/>
-      </w:r>
-      <w:r>
-        <w:t xml:space="preserve">Figure </w:t>
-      </w:r>
-      <w:r>
+      <w:bookmarkEnd w:id="14"/>
+    </w:p>
+    <w:p/>
+    <w:p>
+      <w:pPr>
         <w:rPr>
-          <w:noProof/>
+          <w:ins w:id="15" w:author="Microsoft Office User" w:date="2020-07-30T09:05:00Z"/>
         </w:rPr>
-        <w:t>12</w:t>
-      </w:r>
-      <w:r>
-        <w:fldChar w:fldCharType="end"/>
-      </w:r>
-      <w:r>
-        <w:t xml:space="preserve"> shows the flow of data. </w:t>
-      </w:r>
-    </w:p>
-    <w:p/>
-    <w:p>
-      <w:r>
-        <w:t>To begin with the update population method is called. This changes the state of any infection that is due to change on this day.</w:t>
-      </w:r>
-      <w:r>
-        <w:t xml:space="preserve"> This is explained further in </w:t>
-      </w:r>
-      <w:r>
-        <w:fldChar w:fldCharType="begin"/>
-      </w:r>
-      <w:r>
-        <w:instrText xml:space="preserve"> REF _Ref41499534 \r \h </w:instrText>
-      </w:r>
-      <w:r>
-        <w:fldChar w:fldCharType="separate"/>
-      </w:r>
-      <w:r>
-        <w:t>5.3</w:t>
-      </w:r>
-      <w:r>
-        <w:fldChar w:fldCharType="end"/>
-      </w:r>
-      <w:r>
-        <w:t>.</w:t>
-      </w:r>
-      <w:r>
-        <w:t xml:space="preserve"> This is also where random infections are added to the mix. This is done by running a random number test against each susceptible case and setting their status to EXPOSED. </w:t>
-      </w:r>
-    </w:p>
-    <w:p/>
-    <w:p>
-      <w:r>
-        <w:t xml:space="preserve">Following this, the contact data for this timestep is extracted along with the number of active cases (those not S, R or D), if this is zero and </w:t>
-      </w:r>
-      <w:r>
-        <w:t xml:space="preserve">random infections are off, it will exit here. Otherwise, it will loop over the contact data. </w:t>
-      </w:r>
-    </w:p>
-    <w:p/>
-    <w:p>
-      <w:r>
-        <w:t xml:space="preserve">The contact data is evaluated using a series of conditionals. Firstly, the alert status and weight of the contact are reviewed to see if this is a significant contact. If both alert statuses are NONE and the weight of the contact is greater than exposureThreshold, it is a contact of interest. </w:t>
-      </w:r>
-      <w:r>
-        <w:t xml:space="preserve">Before evaluating the contact further, the two cases are checked to see if their virus statuses are different, if they are the contact is evaluated. </w:t>
-      </w:r>
-    </w:p>
-    <w:p/>
-    <w:p>
-      <w:r>
-        <w:t>The two cases are evaluated to see who is in the more severe state, these are described by the rankings:</w:t>
-      </w:r>
-    </w:p>
-    <w:p/>
-    <w:tbl>
-      <w:tblPr>
-        <w:tblStyle w:val="TableGrid"/>
-        <w:tblW w:w="0" w:type="auto"/>
-        <w:jc w:val="center"/>
-        <w:tblLook w:val="04A0" w:firstRow="1" w:lastRow="0" w:firstColumn="1" w:lastColumn="0" w:noHBand="0" w:noVBand="1"/>
-      </w:tblPr>
-      <w:tblGrid>
-        <w:gridCol w:w="1027"/>
-        <w:gridCol w:w="1845"/>
-      </w:tblGrid>
-      <w:tr>
-        <w:trPr>
-          <w:trHeight w:val="304"/>
-          <w:jc w:val="center"/>
-        </w:trPr>
-        <w:tc>
-          <w:tcPr>
-            <w:tcW w:w="1027" w:type="dxa"/>
-          </w:tcPr>
-          <w:p>
-            <w:r>
-              <w:t>-1</w:t>
-            </w:r>
-          </w:p>
-        </w:tc>
-        <w:tc>
-          <w:tcPr>
-            <w:tcW w:w="1027" w:type="dxa"/>
-          </w:tcPr>
-          <w:p>
-            <w:r>
-              <w:t>DEAD</w:t>
-            </w:r>
-          </w:p>
-        </w:tc>
-      </w:tr>
-      <w:tr>
-        <w:trPr>
-          <w:trHeight w:val="304"/>
-          <w:jc w:val="center"/>
-        </w:trPr>
-        <w:tc>
-          <w:tcPr>
-            <w:tcW w:w="1027" w:type="dxa"/>
-          </w:tcPr>
-          <w:p>
-            <w:r>
-              <w:t>0</w:t>
-            </w:r>
-          </w:p>
-        </w:tc>
-        <w:tc>
-          <w:tcPr>
-            <w:tcW w:w="1027" w:type="dxa"/>
-          </w:tcPr>
-          <w:p>
-            <w:r>
-              <w:t>SUSCEPTIBLE</w:t>
-            </w:r>
-          </w:p>
-        </w:tc>
-      </w:tr>
-      <w:tr>
-        <w:trPr>
-          <w:trHeight w:val="304"/>
-          <w:jc w:val="center"/>
-        </w:trPr>
-        <w:tc>
-          <w:tcPr>
-            <w:tcW w:w="1027" w:type="dxa"/>
-          </w:tcPr>
-          <w:p>
-            <w:r>
-              <w:t>1</w:t>
-            </w:r>
-          </w:p>
-        </w:tc>
-        <w:tc>
-          <w:tcPr>
-            <w:tcW w:w="1027" w:type="dxa"/>
-          </w:tcPr>
-          <w:p>
-            <w:r>
-              <w:t>RECOVERED</w:t>
-            </w:r>
-          </w:p>
-        </w:tc>
-      </w:tr>
-      <w:tr>
-        <w:trPr>
-          <w:trHeight w:val="321"/>
-          <w:jc w:val="center"/>
-        </w:trPr>
-        <w:tc>
-          <w:tcPr>
-            <w:tcW w:w="1027" w:type="dxa"/>
-          </w:tcPr>
-          <w:p>
-            <w:r>
-              <w:t>2</w:t>
-            </w:r>
-          </w:p>
-        </w:tc>
-        <w:tc>
-          <w:tcPr>
-            <w:tcW w:w="1027" w:type="dxa"/>
-          </w:tcPr>
-          <w:p>
-            <w:r>
-              <w:t>EXPOSED</w:t>
-            </w:r>
-          </w:p>
-        </w:tc>
-      </w:tr>
-      <w:tr>
-        <w:trPr>
-          <w:trHeight w:val="304"/>
-          <w:jc w:val="center"/>
-        </w:trPr>
-        <w:tc>
-          <w:tcPr>
-            <w:tcW w:w="1027" w:type="dxa"/>
-          </w:tcPr>
-          <w:p>
-            <w:r>
-              <w:t>3</w:t>
-            </w:r>
-          </w:p>
-        </w:tc>
-        <w:tc>
-          <w:tcPr>
-            <w:tcW w:w="1027" w:type="dxa"/>
-          </w:tcPr>
-          <w:p>
-            <w:r>
-              <w:t>EXPOSED_2</w:t>
-            </w:r>
-          </w:p>
-        </w:tc>
-      </w:tr>
-      <w:tr>
-        <w:trPr>
-          <w:trHeight w:val="304"/>
-          <w:jc w:val="center"/>
-        </w:trPr>
-        <w:tc>
-          <w:tcPr>
-            <w:tcW w:w="1027" w:type="dxa"/>
-          </w:tcPr>
-          <w:p>
-            <w:r>
-              <w:t>4</w:t>
-            </w:r>
-          </w:p>
-        </w:tc>
-        <w:tc>
-          <w:tcPr>
-            <w:tcW w:w="1027" w:type="dxa"/>
-          </w:tcPr>
-          <w:p>
-            <w:r>
-              <w:t>INFECTED</w:t>
-            </w:r>
-          </w:p>
-        </w:tc>
-      </w:tr>
-      <w:tr>
-        <w:trPr>
-          <w:trHeight w:val="304"/>
-          <w:jc w:val="center"/>
-        </w:trPr>
-        <w:tc>
-          <w:tcPr>
-            <w:tcW w:w="1027" w:type="dxa"/>
-          </w:tcPr>
-          <w:p>
-            <w:r>
-              <w:t>5</w:t>
-            </w:r>
-          </w:p>
-        </w:tc>
-        <w:tc>
-          <w:tcPr>
-            <w:tcW w:w="1027" w:type="dxa"/>
-          </w:tcPr>
-          <w:p>
-            <w:r>
-              <w:t>INFECTED_SYMP</w:t>
-            </w:r>
-          </w:p>
-        </w:tc>
-      </w:tr>
-    </w:tbl>
-    <w:p/>
-    <w:p/>
-    <w:p>
-      <w:r>
-        <w:lastRenderedPageBreak/>
-        <w:t>PersonA is the more severe case; the least severe case is personB. A dangerous mix is when personA is infectious (E2, I, IA) and personB is susceptible. If this is the case, the following test is conducted:</w:t>
-      </w:r>
-    </w:p>
-    <w:p/>
+      </w:pPr>
+      <w:r>
+        <w:t xml:space="preserve">The </w:t>
+      </w:r>
+      <w:proofErr w:type="spellStart"/>
+      <w:r>
+        <w:t>runContactData</w:t>
+      </w:r>
+      <w:proofErr w:type="spellEnd"/>
+      <w:r>
+        <w:t xml:space="preserve"> method within Outbreak.java is where the main calculations in the code are triggered. </w:t>
+      </w:r>
+    </w:p>
     <w:p>
       <w:pPr>
         <w:rPr>
-          <w:rFonts w:eastAsiaTheme="minorEastAsia"/>
+          <w:ins w:id="16" w:author="Microsoft Office User" w:date="2020-07-30T09:05:00Z"/>
         </w:rPr>
       </w:pPr>
-      <m:oMathPara>
-        <m:oMath>
-          <m:r>
-            <w:rPr>
-              <w:rFonts w:ascii="Cambria Math" w:hAnsi="Cambria Math"/>
-            </w:rPr>
-            <m:t>n &lt;</m:t>
-          </m:r>
-          <m:f>
-            <m:fPr>
-              <m:ctrlPr>
-                <w:rPr>
-                  <w:rFonts w:ascii="Cambria Math" w:hAnsi="Cambria Math"/>
-                  <w:i/>
-                </w:rPr>
-              </m:ctrlPr>
-            </m:fPr>
-            <m:num>
-              <m:r>
-                <w:rPr>
-                  <w:rFonts w:ascii="Cambria Math" w:hAnsi="Cambria Math"/>
-                </w:rPr>
-                <m:t>weight</m:t>
-              </m:r>
-            </m:num>
-            <m:den>
-              <m:r>
-                <w:rPr>
-                  <w:rFonts w:ascii="Cambria Math" w:hAnsi="Cambria Math"/>
-                </w:rPr>
-                <m:t>exposureTuning</m:t>
-              </m:r>
-            </m:den>
-          </m:f>
-          <m:box>
-            <m:boxPr>
-              <m:opEmu m:val="1"/>
-              <m:ctrlPr>
-                <w:rPr>
-                  <w:rFonts w:ascii="Cambria Math" w:hAnsi="Cambria Math"/>
-                  <w:i/>
-                </w:rPr>
-              </m:ctrlPr>
-            </m:boxPr>
-            <m:e>
-              <m:groupChr>
-                <m:groupChrPr>
-                  <m:chr m:val="→"/>
-                  <m:vertJc m:val="bot"/>
-                  <m:ctrlPr>
-                    <w:rPr>
-                      <w:rFonts w:ascii="Cambria Math" w:hAnsi="Cambria Math"/>
-                      <w:i/>
-                    </w:rPr>
-                  </m:ctrlPr>
-                </m:groupChrPr>
-                <m:e>
-                  <m:r>
-                    <w:rPr>
-                      <w:rFonts w:ascii="Cambria Math" w:hAnsi="Cambria Math"/>
-                    </w:rPr>
-                    <m:t xml:space="preserve">    </m:t>
-                  </m:r>
-                </m:e>
-              </m:groupChr>
-            </m:e>
-          </m:box>
-          <m:r>
-            <w:rPr>
-              <w:rFonts w:ascii="Cambria Math" w:hAnsi="Cambria Math"/>
-            </w:rPr>
-            <m:t>EXPOSED</m:t>
-          </m:r>
-        </m:oMath>
-      </m:oMathPara>
-    </w:p>
-    <w:p/>
-    <w:p>
-      <w:r>
-        <w:t xml:space="preserve">Where n is a random number. </w:t>
-      </w:r>
-    </w:p>
-    <w:p/>
-    <w:p/>
-    <w:p>
-      <w:pPr>
-        <w:keepNext/>
-        <w:jc w:val="center"/>
+    </w:p>
+    <w:p>
+      <w:pPr>
+        <w:rPr>
+          <w:ins w:id="17" w:author="Microsoft Office User" w:date="2020-07-30T09:05:00Z"/>
+        </w:rPr>
+      </w:pPr>
+    </w:p>
+    <w:p>
+      <w:pPr>
+        <w:rPr>
+          <w:ins w:id="18" w:author="Microsoft Office User" w:date="2020-07-30T09:05:00Z"/>
+        </w:rPr>
       </w:pPr>
       <w:r>
         <w:rPr>
@@ -3697,9 +3208,9 @@
         </w:rPr>
         <w:drawing>
           <wp:inline distT="0" distB="0" distL="0" distR="0">
-            <wp:extent cx="6236522" cy="3185328"/>
-            <wp:effectExtent l="0" t="0" r="0" b="2540"/>
-            <wp:docPr id="19" name="Picture 19"/>
+            <wp:extent cx="4061069" cy="3555192"/>
+            <wp:effectExtent l="0" t="0" r="3175" b="1270"/>
+            <wp:docPr id="2" name="Picture 2"/>
             <wp:cNvGraphicFramePr>
               <a:graphicFrameLocks xmlns:a="http://schemas.openxmlformats.org/drawingml/2006/main" noChangeAspect="1"/>
             </wp:cNvGraphicFramePr>
@@ -3707,7 +3218,7 @@
               <a:graphicData uri="http://schemas.openxmlformats.org/drawingml/2006/picture">
                 <pic:pic xmlns:pic="http://schemas.openxmlformats.org/drawingml/2006/picture">
                   <pic:nvPicPr>
-                    <pic:cNvPr id="19" name="Screenshot 2020-05-27 at 18.43.27.png"/>
+                    <pic:cNvPr id="2" name="Screenshot 2020-07-30 at 09.18.39.png"/>
                     <pic:cNvPicPr/>
                   </pic:nvPicPr>
                   <pic:blipFill>
@@ -3725,7 +3236,7 @@
                   <pic:spPr>
                     <a:xfrm>
                       <a:off x="0" y="0"/>
-                      <a:ext cx="6267611" cy="3201207"/>
+                      <a:ext cx="4094473" cy="3584435"/>
                     </a:xfrm>
                     <a:prstGeom prst="rect">
                       <a:avLst/>
@@ -3738,217 +3249,120 @@
         </w:drawing>
       </w:r>
     </w:p>
-    <w:p>
-      <w:pPr>
-        <w:pStyle w:val="Caption"/>
-        <w:jc w:val="center"/>
-      </w:pPr>
-      <w:bookmarkStart w:id="16" w:name="_Ref41497488"/>
-      <w:r>
-        <w:t xml:space="preserve">Figure </w:t>
-      </w:r>
-      <w:r>
-        <w:fldChar w:fldCharType="begin"/>
-      </w:r>
-      <w:r>
-        <w:instrText xml:space="preserve"> SEQ Figure \* ARABIC </w:instrText>
-      </w:r>
-      <w:r>
-        <w:fldChar w:fldCharType="separate"/>
-      </w:r>
-      <w:r>
-        <w:rPr>
-          <w:noProof/>
-        </w:rPr>
-        <w:t>12</w:t>
-      </w:r>
-      <w:r>
-        <w:fldChar w:fldCharType="end"/>
-      </w:r>
-      <w:bookmarkEnd w:id="16"/>
-      <w:r>
-        <w:t xml:space="preserve"> The logic flow for reviewing contact data</w:t>
-      </w:r>
-    </w:p>
-    <w:p/>
-    <w:p/>
-    <w:p/>
-    <w:p/>
-    <w:p>
-      <w:pPr>
-        <w:pStyle w:val="Heading3"/>
+    <w:p/>
+    <w:p>
+      <w:r>
+        <w:br w:type="page"/>
+      </w:r>
+    </w:p>
+    <w:p/>
+    <w:p>
+      <w:pPr>
+        <w:pStyle w:val="Heading2"/>
+        <w:numPr>
+          <w:ilvl w:val="0"/>
+          <w:numId w:val="1"/>
+        </w:numPr>
+      </w:pPr>
+      <w:r>
+        <w:t>Event Runner</w:t>
+      </w:r>
+    </w:p>
+    <w:p/>
+    <w:p>
+      <w:r>
+        <w:t>The events within the model are handled by a group of lists that contain specific events that can occur in the model. These are:</w:t>
+      </w:r>
+    </w:p>
+    <w:p/>
+    <w:p>
+      <w:pPr>
+        <w:pStyle w:val="ListParagraph"/>
+        <w:numPr>
+          <w:ilvl w:val="0"/>
+          <w:numId w:val="12"/>
+        </w:numPr>
+      </w:pPr>
+      <w:r>
+        <w:t>Alert Event</w:t>
+      </w:r>
+    </w:p>
+    <w:p>
+      <w:pPr>
+        <w:pStyle w:val="ListParagraph"/>
+        <w:numPr>
+          <w:ilvl w:val="0"/>
+          <w:numId w:val="12"/>
+        </w:numPr>
+      </w:pPr>
+      <w:r>
+        <w:t>Contact Event</w:t>
+      </w:r>
+    </w:p>
+    <w:p>
+      <w:pPr>
+        <w:pStyle w:val="ListParagraph"/>
+        <w:numPr>
+          <w:ilvl w:val="0"/>
+          <w:numId w:val="12"/>
+        </w:numPr>
+      </w:pPr>
+      <w:r>
+        <w:t>Infection Event</w:t>
+      </w:r>
+    </w:p>
+    <w:p>
+      <w:pPr>
+        <w:pStyle w:val="ListParagraph"/>
+        <w:numPr>
+          <w:ilvl w:val="0"/>
+          <w:numId w:val="12"/>
+        </w:numPr>
+      </w:pPr>
+      <w:r>
+        <w:t>Virus Event</w:t>
+      </w:r>
+    </w:p>
+    <w:p/>
+    <w:p>
+      <w:r>
+        <w:t xml:space="preserve">Each of these events are processed in different ways and can trigger other events to occur at a future time. </w:t>
+      </w:r>
+    </w:p>
+    <w:p/>
+    <w:p>
+      <w:pPr>
+        <w:pStyle w:val="Heading2"/>
         <w:numPr>
           <w:ilvl w:val="1"/>
           <w:numId w:val="1"/>
         </w:numPr>
       </w:pPr>
-      <w:bookmarkStart w:id="17" w:name="_Ref41494048"/>
-      <w:r>
-        <w:t xml:space="preserve">Run </w:t>
-      </w:r>
-      <w:r>
-        <w:t>t</w:t>
-      </w:r>
-      <w:r>
-        <w:t xml:space="preserve">o </w:t>
-      </w:r>
-      <w:bookmarkEnd w:id="17"/>
-      <w:r>
-        <w:t>Steady State</w:t>
-      </w:r>
-    </w:p>
-    <w:p/>
-    <w:p>
-      <w:r>
-        <w:t xml:space="preserve">During the run to Steady-state routine, shown in </w:t>
-      </w:r>
-      <w:r>
-        <w:fldChar w:fldCharType="begin"/>
-      </w:r>
-      <w:r>
-        <w:instrText xml:space="preserve"> REF _Ref41508471 \h </w:instrText>
-      </w:r>
-      <w:r>
-        <w:fldChar w:fldCharType="separate"/>
-      </w:r>
-      <w:r>
-        <w:t xml:space="preserve">Figure </w:t>
-      </w:r>
-      <w:r>
-        <w:rPr>
-          <w:noProof/>
-        </w:rPr>
-        <w:t>13</w:t>
-      </w:r>
-      <w:r>
-        <w:fldChar w:fldCharType="end"/>
-      </w:r>
-      <w:r>
-        <w:t xml:space="preserve">, updates the population statuses until the existing active cases are resolved, </w:t>
-      </w:r>
-      <w:r>
-        <w:t>i.e.</w:t>
-      </w:r>
-      <w:r>
-        <w:t xml:space="preserve"> all active cases resolve in recovery or death. The exit condition is </w:t>
-      </w:r>
-    </w:p>
-    <w:p/>
-    <w:p>
-      <m:oMathPara>
-        <m:oMath>
-          <m:r>
-            <w:rPr>
-              <w:rFonts w:ascii="Cambria Math" w:hAnsi="Cambria Math"/>
-            </w:rPr>
-            <m:t>0=</m:t>
-          </m:r>
-          <m:nary>
-            <m:naryPr>
-              <m:chr m:val="∑"/>
-              <m:limLoc m:val="undOvr"/>
-              <m:subHide m:val="1"/>
-              <m:supHide m:val="1"/>
-              <m:ctrlPr>
-                <w:rPr>
-                  <w:rFonts w:ascii="Cambria Math" w:hAnsi="Cambria Math"/>
-                  <w:i/>
-                </w:rPr>
-              </m:ctrlPr>
-            </m:naryPr>
-            <m:sub/>
-            <m:sup/>
-            <m:e>
-              <m:m>
-                <m:mPr>
-                  <m:mcs>
-                    <m:mc>
-                      <m:mcPr>
-                        <m:count m:val="1"/>
-                        <m:mcJc m:val="center"/>
-                      </m:mcPr>
-                    </m:mc>
-                  </m:mcs>
-                  <m:ctrlPr>
-                    <w:rPr>
-                      <w:rFonts w:ascii="Cambria Math" w:hAnsi="Cambria Math"/>
-                      <w:i/>
-                    </w:rPr>
-                  </m:ctrlPr>
-                </m:mPr>
-                <m:mr>
-                  <m:e>
-                    <m:r>
-                      <w:rPr>
-                        <w:rFonts w:ascii="Cambria Math" w:hAnsi="Cambria Math"/>
-                      </w:rPr>
-                      <m:t>exposed</m:t>
-                    </m:r>
-                  </m:e>
-                </m:mr>
-                <m:mr>
-                  <m:e>
-                    <m:m>
-                      <m:mPr>
-                        <m:mcs>
-                          <m:mc>
-                            <m:mcPr>
-                              <m:count m:val="1"/>
-                              <m:mcJc m:val="center"/>
-                            </m:mcPr>
-                          </m:mc>
-                        </m:mcs>
-                        <m:ctrlPr>
-                          <w:rPr>
-                            <w:rFonts w:ascii="Cambria Math" w:hAnsi="Cambria Math"/>
-                            <w:i/>
-                          </w:rPr>
-                        </m:ctrlPr>
-                      </m:mPr>
-                      <m:mr>
-                        <m:e>
-                          <m:r>
-                            <w:rPr>
-                              <w:rFonts w:ascii="Cambria Math" w:hAnsi="Cambria Math"/>
-                            </w:rPr>
-                            <m:t>exposed_2</m:t>
-                          </m:r>
-                        </m:e>
-                      </m:mr>
-                      <m:mr>
-                        <m:e>
-                          <m:r>
-                            <w:rPr>
-                              <w:rFonts w:ascii="Cambria Math" w:hAnsi="Cambria Math"/>
-                            </w:rPr>
-                            <m:t>infected</m:t>
-                          </m:r>
-                        </m:e>
-                      </m:mr>
-                      <m:mr>
-                        <m:e>
-                          <m:r>
-                            <w:rPr>
-                              <w:rFonts w:ascii="Cambria Math" w:hAnsi="Cambria Math"/>
-                            </w:rPr>
-                            <m:t>infected_symp</m:t>
-                          </m:r>
-                        </m:e>
-                      </m:mr>
-                    </m:m>
-                  </m:e>
-                </m:mr>
-              </m:m>
-            </m:e>
-          </m:nary>
-        </m:oMath>
-      </m:oMathPara>
-    </w:p>
-    <w:p/>
-    <w:p>
-      <w:pPr>
-        <w:jc w:val="center"/>
-      </w:pPr>
+      <w:r>
+        <w:t>Contact Event</w:t>
+      </w:r>
+    </w:p>
+    <w:p/>
+    <w:p>
+      <w:r>
+        <w:t xml:space="preserve">Contact events are set in the contacts.csv file. They involve the interaction between two people at a given time. The duration/proximity of the event is measured using the weight parameter. </w:t>
+      </w:r>
+    </w:p>
+    <w:p/>
+    <w:p>
+      <w:r>
+        <w:t xml:space="preserve">When a contact event takes place the two people are assessed based on their Virus Statuses, this allows the model to assess if the contact has the potential to spread the infection. </w:t>
+      </w:r>
+      <w:r>
+        <w:t xml:space="preserve">One or both of the contacts may be in isolation, so the contact may not take place. The isolation policies are expanded upon below. </w:t>
+      </w:r>
+    </w:p>
+    <w:p/>
+    <w:p/>
+    <w:p/>
+    <w:p/>
+    <w:p/>
+    <w:p>
       <w:r>
         <w:rPr>
           <w:noProof/>
@@ -3956,9 +3370,9 @@
         <w:lastRenderedPageBreak/>
         <w:drawing>
           <wp:inline distT="0" distB="0" distL="0" distR="0">
-            <wp:extent cx="3546571" cy="2091376"/>
+            <wp:extent cx="5727700" cy="4681855"/>
             <wp:effectExtent l="0" t="0" r="0" b="4445"/>
-            <wp:docPr id="24" name="Picture 24"/>
+            <wp:docPr id="4" name="Picture 4"/>
             <wp:cNvGraphicFramePr>
               <a:graphicFrameLocks xmlns:a="http://schemas.openxmlformats.org/drawingml/2006/main" noChangeAspect="1"/>
             </wp:cNvGraphicFramePr>
@@ -3966,7 +3380,7 @@
               <a:graphicData uri="http://schemas.openxmlformats.org/drawingml/2006/picture">
                 <pic:pic xmlns:pic="http://schemas.openxmlformats.org/drawingml/2006/picture">
                   <pic:nvPicPr>
-                    <pic:cNvPr id="24" name="Screenshot 2020-05-27 at 21.45.52.png"/>
+                    <pic:cNvPr id="4" name="Screenshot 2020-07-30 at 09.38.24.png"/>
                     <pic:cNvPicPr/>
                   </pic:nvPicPr>
                   <pic:blipFill>
@@ -3984,7 +3398,7 @@
                   <pic:spPr>
                     <a:xfrm>
                       <a:off x="0" y="0"/>
-                      <a:ext cx="3556632" cy="2097309"/>
+                      <a:ext cx="5727700" cy="4681855"/>
                     </a:xfrm>
                     <a:prstGeom prst="rect">
                       <a:avLst/>
@@ -3999,96 +3413,32 @@
     </w:p>
     <w:p>
       <w:pPr>
-        <w:pStyle w:val="Caption"/>
-        <w:jc w:val="center"/>
-      </w:pPr>
-      <w:bookmarkStart w:id="18" w:name="_Ref41508463"/>
-      <w:bookmarkStart w:id="19" w:name="_Ref41508471"/>
-      <w:r>
-        <w:t xml:space="preserve">Figure </w:t>
-      </w:r>
-      <w:r>
-        <w:fldChar w:fldCharType="begin"/>
-      </w:r>
-      <w:r>
-        <w:instrText xml:space="preserve"> SEQ Figure \* ARABIC </w:instrText>
-      </w:r>
-      <w:r>
-        <w:fldChar w:fldCharType="separate"/>
-      </w:r>
-      <w:r>
-        <w:rPr>
-          <w:noProof/>
-        </w:rPr>
-        <w:t>13</w:t>
-      </w:r>
-      <w:r>
-        <w:fldChar w:fldCharType="end"/>
-      </w:r>
-      <w:bookmarkEnd w:id="19"/>
-      <w:r>
-        <w:t xml:space="preserve"> The run to completion algorithm</w:t>
-      </w:r>
-      <w:bookmarkEnd w:id="18"/>
-    </w:p>
-    <w:p/>
-    <w:p>
-      <w:pPr>
-        <w:pStyle w:val="Heading3"/>
+        <w:pStyle w:val="Heading2"/>
         <w:numPr>
           <w:ilvl w:val="1"/>
           <w:numId w:val="1"/>
         </w:numPr>
       </w:pPr>
-      <w:bookmarkStart w:id="20" w:name="_Ref41499534"/>
-      <w:r>
-        <w:t>Update population</w:t>
-      </w:r>
-      <w:bookmarkEnd w:id="20"/>
-    </w:p>
-    <w:p/>
-    <w:p>
-      <w:r>
-        <w:t xml:space="preserve">The update population algorithm, shown in </w:t>
-      </w:r>
-      <w:r>
-        <w:fldChar w:fldCharType="begin"/>
-      </w:r>
-      <w:r>
-        <w:instrText xml:space="preserve"> REF _Ref41510960 \h </w:instrText>
-      </w:r>
-      <w:r>
-        <w:fldChar w:fldCharType="separate"/>
-      </w:r>
-      <w:r>
-        <w:t xml:space="preserve">Figure </w:t>
-      </w:r>
-      <w:r>
-        <w:rPr>
-          <w:noProof/>
-        </w:rPr>
-        <w:t>14</w:t>
-      </w:r>
-      <w:r>
-        <w:fldChar w:fldCharType="end"/>
-      </w:r>
-      <w:r>
-        <w:t xml:space="preserve">, is run as part of Run Contact Data and Steady State. Each case has fields containing the next time their statuses change. </w:t>
-      </w:r>
-    </w:p>
-    <w:p>
-      <w:pPr>
-        <w:jc w:val="center"/>
-      </w:pPr>
+      <w:r>
+        <w:t>Alert Event</w:t>
+      </w:r>
+    </w:p>
+    <w:p/>
+    <w:p>
+      <w:r>
+        <w:t xml:space="preserve">The alert event processor is used to cycle through the states of disease alert that a member of the population can be in at any one point. </w:t>
+      </w:r>
+    </w:p>
+    <w:p>
       <w:r>
         <w:rPr>
           <w:noProof/>
         </w:rPr>
         <w:drawing>
-          <wp:inline distT="0" distB="0" distL="0" distR="0" wp14:anchorId="7A7217CF" wp14:editId="06084C79">
-            <wp:extent cx="5727700" cy="4020185"/>
-            <wp:effectExtent l="0" t="0" r="0" b="5715"/>
-            <wp:docPr id="25" name="Picture 25"/>
+          <wp:inline distT="0" distB="0" distL="0" distR="0">
+            <wp:extent cx="5727700" cy="1226820"/>
+            <wp:effectExtent l="0" t="0" r="0" b="5080"/>
+            <wp:docPr id="15" name="Picture 15"/>
             <wp:cNvGraphicFramePr>
               <a:graphicFrameLocks xmlns:a="http://schemas.openxmlformats.org/drawingml/2006/main" noChangeAspect="1"/>
             </wp:cNvGraphicFramePr>
@@ -4096,7 +3446,7 @@
               <a:graphicData uri="http://schemas.openxmlformats.org/drawingml/2006/picture">
                 <pic:pic xmlns:pic="http://schemas.openxmlformats.org/drawingml/2006/picture">
                   <pic:nvPicPr>
-                    <pic:cNvPr id="25" name="Screenshot 2020-05-27 at 22.27.51.png"/>
+                    <pic:cNvPr id="15" name="Screenshot 2020-07-31 at 16.04.26.png"/>
                     <pic:cNvPicPr/>
                   </pic:nvPicPr>
                   <pic:blipFill>
@@ -4114,7 +3464,7 @@
                   <pic:spPr>
                     <a:xfrm>
                       <a:off x="0" y="0"/>
-                      <a:ext cx="5727700" cy="4020185"/>
+                      <a:ext cx="5727700" cy="1226820"/>
                     </a:xfrm>
                     <a:prstGeom prst="rect">
                       <a:avLst/>
@@ -4127,289 +3477,107 @@
         </w:drawing>
       </w:r>
     </w:p>
-    <w:p>
-      <w:pPr>
-        <w:pStyle w:val="Caption"/>
-        <w:jc w:val="center"/>
-      </w:pPr>
-      <w:bookmarkStart w:id="21" w:name="_Ref41510960"/>
-      <w:r>
-        <w:t xml:space="preserve">Figure </w:t>
-      </w:r>
-      <w:r>
-        <w:fldChar w:fldCharType="begin"/>
-      </w:r>
-      <w:r>
-        <w:instrText xml:space="preserve"> SEQ Figure \* ARABIC </w:instrText>
-      </w:r>
-      <w:r>
-        <w:fldChar w:fldCharType="separate"/>
-      </w:r>
+    <w:p/>
+    <w:p>
+      <w:r>
+        <w:t xml:space="preserve">The person has their status set to a corresponding status and the next status is calculated for a time in the future. </w:t>
+      </w:r>
+      <w:r>
+        <w:t xml:space="preserve">The result of the test is determined by whether the individual is currently infectious and a dice roll against the accuracy of the test. The number of false positives and negatives is recorded as an output statistic. </w:t>
+      </w:r>
+    </w:p>
+    <w:p>
       <w:r>
         <w:rPr>
           <w:noProof/>
         </w:rPr>
-        <w:t>14</w:t>
-      </w:r>
-      <w:r>
-        <w:fldChar w:fldCharType="end"/>
-      </w:r>
-      <w:bookmarkEnd w:id="21"/>
-      <w:r>
-        <w:t xml:space="preserve"> The update population algorithm</w:t>
-      </w:r>
-    </w:p>
-    <w:p/>
-    <w:p/>
-    <w:p/>
-    <w:p/>
-    <w:p/>
-    <w:p>
-      <w:pPr>
-        <w:pStyle w:val="Heading4"/>
+        <w:lastRenderedPageBreak/>
+        <w:drawing>
+          <wp:inline distT="0" distB="0" distL="0" distR="0">
+            <wp:extent cx="4352192" cy="3718663"/>
+            <wp:effectExtent l="0" t="0" r="4445" b="2540"/>
+            <wp:docPr id="16" name="Picture 16"/>
+            <wp:cNvGraphicFramePr>
+              <a:graphicFrameLocks xmlns:a="http://schemas.openxmlformats.org/drawingml/2006/main" noChangeAspect="1"/>
+            </wp:cNvGraphicFramePr>
+            <a:graphic xmlns:a="http://schemas.openxmlformats.org/drawingml/2006/main">
+              <a:graphicData uri="http://schemas.openxmlformats.org/drawingml/2006/picture">
+                <pic:pic xmlns:pic="http://schemas.openxmlformats.org/drawingml/2006/picture">
+                  <pic:nvPicPr>
+                    <pic:cNvPr id="16" name="AlertEvent.png"/>
+                    <pic:cNvPicPr/>
+                  </pic:nvPicPr>
+                  <pic:blipFill>
+                    <a:blip r:embed="rId20">
+                      <a:extLst>
+                        <a:ext uri="{28A0092B-C50C-407E-A947-70E740481C1C}">
+                          <a14:useLocalDpi xmlns:a14="http://schemas.microsoft.com/office/drawing/2010/main" val="0"/>
+                        </a:ext>
+                      </a:extLst>
+                    </a:blip>
+                    <a:stretch>
+                      <a:fillRect/>
+                    </a:stretch>
+                  </pic:blipFill>
+                  <pic:spPr>
+                    <a:xfrm>
+                      <a:off x="0" y="0"/>
+                      <a:ext cx="4362749" cy="3727684"/>
+                    </a:xfrm>
+                    <a:prstGeom prst="rect">
+                      <a:avLst/>
+                    </a:prstGeom>
+                  </pic:spPr>
+                </pic:pic>
+              </a:graphicData>
+            </a:graphic>
+          </wp:inline>
+        </w:drawing>
+      </w:r>
+    </w:p>
+    <w:p/>
+    <w:p>
+      <w:pPr>
+        <w:pStyle w:val="Heading2"/>
         <w:numPr>
-          <w:ilvl w:val="2"/>
+          <w:ilvl w:val="1"/>
           <w:numId w:val="1"/>
         </w:numPr>
       </w:pPr>
       <w:r>
-        <w:lastRenderedPageBreak/>
-        <w:t>Virus Status</w:t>
-      </w:r>
-    </w:p>
-    <w:p/>
-    <w:p/>
-    <w:p>
-      <w:r>
-        <w:t>The virus status is updated first, both Exposed and Infected have a single option, which they progress to, the next status change is calculated using the mean and max times from the disease properties and the chosen random number distribution. Exposed</w:t>
-      </w:r>
-      <w:r>
-        <w:rPr>
-          <w:vertAlign w:val="subscript"/>
-        </w:rPr>
-        <w:t>2</w:t>
-      </w:r>
-      <w:r>
-        <w:t xml:space="preserve"> and Infected</w:t>
-      </w:r>
-      <w:r>
-        <w:rPr>
-          <w:vertAlign w:val="subscript"/>
-        </w:rPr>
-        <w:t>su</w:t>
-      </w:r>
-      <w:r>
-        <w:rPr>
-          <w:vertAlign w:val="subscript"/>
-        </w:rPr>
-        <w:t>mp</w:t>
-      </w:r>
-      <w:r>
-        <w:rPr>
-          <w:vertAlign w:val="subscript"/>
-        </w:rPr>
-        <w:t xml:space="preserve"> </w:t>
-      </w:r>
-      <w:r>
-        <w:t>have two options, denoted by the red box. These are chosen by random number, n:</w:t>
-      </w:r>
-    </w:p>
-    <w:p/>
-    <w:p>
-      <w:pPr>
-        <w:rPr>
-          <w:rFonts w:eastAsiaTheme="minorEastAsia"/>
-        </w:rPr>
-      </w:pPr>
-      <m:oMathPara>
-        <m:oMath>
-          <m:m>
-            <m:mPr>
-              <m:mcs>
-                <m:mc>
-                  <m:mcPr>
-                    <m:count m:val="1"/>
-                    <m:mcJc m:val="center"/>
-                  </m:mcPr>
-                </m:mc>
-              </m:mcs>
-              <m:ctrlPr>
-                <w:rPr>
-                  <w:rFonts w:ascii="Cambria Math" w:hAnsi="Cambria Math"/>
-                  <w:i/>
-                </w:rPr>
-              </m:ctrlPr>
-            </m:mPr>
-            <m:mr>
-              <m:e>
-                <m:r>
-                  <w:rPr>
-                    <w:rFonts w:ascii="Cambria Math" w:hAnsi="Cambria Math"/>
-                  </w:rPr>
-                  <m:t xml:space="preserve">n&gt;health→INFECTED        </m:t>
-                </m:r>
-              </m:e>
-            </m:mr>
-            <m:mr>
-              <m:e>
-                <m:r>
-                  <w:rPr>
-                    <w:rFonts w:ascii="Cambria Math" w:hAnsi="Cambria Math"/>
-                  </w:rPr>
-                  <m:t>n≤health→</m:t>
-                </m:r>
-                <m:sSub>
-                  <m:sSubPr>
-                    <m:ctrlPr>
-                      <w:rPr>
-                        <w:rFonts w:ascii="Cambria Math" w:hAnsi="Cambria Math"/>
-                        <w:i/>
-                      </w:rPr>
-                    </m:ctrlPr>
-                  </m:sSubPr>
-                  <m:e>
-                    <m:r>
-                      <w:rPr>
-                        <w:rFonts w:ascii="Cambria Math" w:hAnsi="Cambria Math"/>
-                      </w:rPr>
-                      <m:t>INFECTED</m:t>
-                    </m:r>
-                  </m:e>
-                  <m:sub>
-                    <m:r>
-                      <w:rPr>
-                        <w:rFonts w:ascii="Cambria Math" w:hAnsi="Cambria Math"/>
-                      </w:rPr>
-                      <m:t>symp</m:t>
-                    </m:r>
-                  </m:sub>
-                </m:sSub>
-              </m:e>
-            </m:mr>
-          </m:m>
-        </m:oMath>
-      </m:oMathPara>
-    </w:p>
-    <w:p/>
-    <w:p>
-      <w:r>
-        <w:t>Likewise, the outcome of an Infected</w:t>
-      </w:r>
-      <w:r>
-        <w:rPr>
-          <w:vertAlign w:val="subscript"/>
-        </w:rPr>
-        <w:t>su</w:t>
-      </w:r>
-      <w:r>
-        <w:rPr>
-          <w:vertAlign w:val="subscript"/>
-        </w:rPr>
-        <w:t>mp</w:t>
-      </w:r>
-      <w:r>
-        <w:rPr>
-          <w:vertAlign w:val="subscript"/>
-        </w:rPr>
-        <w:t xml:space="preserve"> </w:t>
-      </w:r>
-      <w:r>
-        <w:t>is determined by:</w:t>
-      </w:r>
-    </w:p>
-    <w:p/>
-    <w:p>
-      <w:pPr>
-        <w:rPr>
-          <w:rFonts w:eastAsiaTheme="minorEastAsia"/>
-        </w:rPr>
-      </w:pPr>
-      <m:oMathPara>
-        <m:oMath>
-          <m:m>
-            <m:mPr>
-              <m:mcs>
-                <m:mc>
-                  <m:mcPr>
-                    <m:count m:val="1"/>
-                    <m:mcJc m:val="center"/>
-                  </m:mcPr>
-                </m:mc>
-              </m:mcs>
-              <m:ctrlPr>
-                <w:rPr>
-                  <w:rFonts w:ascii="Cambria Math" w:hAnsi="Cambria Math"/>
-                  <w:i/>
-                </w:rPr>
-              </m:ctrlPr>
-            </m:mPr>
-            <m:mr>
-              <m:e>
-                <m:r>
-                  <w:rPr>
-                    <w:rFonts w:ascii="Cambria Math" w:hAnsi="Cambria Math"/>
-                  </w:rPr>
-                  <m:t xml:space="preserve">n&gt;health→RECOVERED        </m:t>
-                </m:r>
-              </m:e>
-            </m:mr>
-            <m:mr>
-              <m:e>
-                <m:r>
-                  <w:rPr>
-                    <w:rFonts w:ascii="Cambria Math" w:hAnsi="Cambria Math"/>
-                  </w:rPr>
-                  <m:t xml:space="preserve">n≤health→DEAD                      </m:t>
-                </m:r>
-              </m:e>
-            </m:mr>
-          </m:m>
-        </m:oMath>
-      </m:oMathPara>
-    </w:p>
-    <w:p/>
-    <w:p>
-      <w:pPr>
-        <w:pStyle w:val="Heading4"/>
+        <w:t>Infection Event</w:t>
+      </w:r>
+    </w:p>
+    <w:p/>
+    <w:p/>
+    <w:p>
+      <w:pPr>
+        <w:pStyle w:val="Heading2"/>
         <w:numPr>
-          <w:ilvl w:val="2"/>
+          <w:ilvl w:val="1"/>
           <w:numId w:val="1"/>
         </w:numPr>
       </w:pPr>
       <w:r>
-        <w:t>Alert Status</w:t>
-      </w:r>
-    </w:p>
-    <w:p/>
-    <w:p>
-      <w:r>
-        <w:t xml:space="preserve">The alert status only has one choice, the outcome of the test. In this method, the result of the test is determined by the step before, </w:t>
-      </w:r>
-      <w:r>
-        <w:t>i.e.</w:t>
-      </w:r>
-      <w:r>
-        <w:t xml:space="preserve"> the recipient of the test needs to be infectious when tested, not when receiving the result. The red box here denotes the storing of a </w:t>
-      </w:r>
-      <w:r>
-        <w:t>Boolean</w:t>
-      </w:r>
-      <w:r>
-        <w:t xml:space="preserve"> of </w:t>
-      </w:r>
-      <w:r>
-        <w:t>‘</w:t>
-      </w:r>
-      <w:r>
-        <w:t>wasInfected</w:t>
-      </w:r>
-      <w:r>
-        <w:t>’</w:t>
-      </w:r>
-      <w:r>
-        <w:t xml:space="preserve"> at the time the test was taken. This is then used when the test result is in. </w:t>
-      </w:r>
-    </w:p>
+        <w:t>Virus Event</w:t>
+      </w:r>
+    </w:p>
+    <w:p/>
+    <w:p>
+      <w:r>
+        <w:t xml:space="preserve">A virus event is the progression of the virus through in compartments. The initial infection is not included as this is an Infection Event. The processing of the event is very similar to the previous sections, with the exception of checking for alerts based on the virus status of the individual. This process creates alert events for people who have been in contact with the individual. The individual has a </w:t>
+      </w:r>
+      <w:proofErr w:type="spellStart"/>
+      <w:r>
+        <w:t>reportingCompliance</w:t>
+      </w:r>
+      <w:proofErr w:type="spellEnd"/>
+      <w:r>
+        <w:t xml:space="preserve"> field that may reduce the chance of an individual reporting symptoms. The alert checker and tracing policies are covered below.  </w:t>
+      </w:r>
+    </w:p>
+    <w:p/>
+    <w:p/>
     <w:p/>
     <w:p>
       <w:pPr>
@@ -4420,6 +3588,389 @@
         </w:numPr>
       </w:pPr>
       <w:r>
+        <w:t>Isolation Policy</w:t>
+      </w:r>
+    </w:p>
+    <w:p/>
+    <w:p>
+      <w:r>
+        <w:t xml:space="preserve">The isolation policy logic is stored in the </w:t>
+      </w:r>
+      <w:proofErr w:type="spellStart"/>
+      <w:proofErr w:type="gramStart"/>
+      <w:r>
+        <w:t>policy.isolation</w:t>
+      </w:r>
+      <w:proofErr w:type="spellEnd"/>
+      <w:proofErr w:type="gramEnd"/>
+      <w:r>
+        <w:t xml:space="preserve"> package. A list of policies </w:t>
+      </w:r>
+      <w:r>
+        <w:t>is</w:t>
+      </w:r>
+      <w:r>
+        <w:t xml:space="preserve"> input from the </w:t>
+      </w:r>
+      <w:proofErr w:type="spellStart"/>
+      <w:r>
+        <w:t>isolationPolicies.json</w:t>
+      </w:r>
+      <w:proofErr w:type="spellEnd"/>
+      <w:r>
+        <w:t xml:space="preserve"> file. These include policies for global, virus status, alert status and a default. The default policy will typically be to not isolate. Each policy has a priority value which allows the most relevant policy to be chosen. </w:t>
+      </w:r>
+    </w:p>
+    <w:p/>
+    <w:p/>
+    <w:p>
+      <w:pPr>
+        <w:pStyle w:val="Heading2"/>
+        <w:numPr>
+          <w:ilvl w:val="1"/>
+          <w:numId w:val="1"/>
+        </w:numPr>
+      </w:pPr>
+      <w:r>
+        <w:t>Global Policies</w:t>
+      </w:r>
+    </w:p>
+    <w:p>
+      <w:r>
+        <w:t xml:space="preserve">Global policies are based on the proportion of the population infected. For example, a “stay at home” policy may be put into place if more than 10% of the population are infected, </w:t>
+      </w:r>
+      <w:r>
+        <w:lastRenderedPageBreak/>
+        <w:t xml:space="preserve">whereas a “stay alert” policy may be in place if between 5-10% of the population are infected. These values are as an example and can be configured in the input. </w:t>
+      </w:r>
+    </w:p>
+    <w:p/>
+    <w:p>
+      <w:pPr>
+        <w:pStyle w:val="Heading2"/>
+        <w:numPr>
+          <w:ilvl w:val="1"/>
+          <w:numId w:val="1"/>
+        </w:numPr>
+      </w:pPr>
+      <w:r>
+        <w:t>Virus Status Policies</w:t>
+      </w:r>
+    </w:p>
+    <w:p>
+      <w:r>
+        <w:t xml:space="preserve">An isolation policy can be defined based on the virus status of an individual. For example, symptomatic individuals may be required to stay at home for a defined period. The proportion required to isolate and duration of the isolation can be defined in the input. </w:t>
+      </w:r>
+    </w:p>
+    <w:p/>
+    <w:p/>
+    <w:p>
+      <w:pPr>
+        <w:pStyle w:val="Heading2"/>
+        <w:numPr>
+          <w:ilvl w:val="1"/>
+          <w:numId w:val="1"/>
+        </w:numPr>
+      </w:pPr>
+      <w:r>
+        <w:t>Alert Status Policies</w:t>
+      </w:r>
+    </w:p>
+    <w:p>
+      <w:r>
+        <w:t xml:space="preserve">A policy can be defined for any of the alert statuses, much like with a virus status, the proportion required to isolate and duration of the isolation can be defined in the input. </w:t>
+      </w:r>
+    </w:p>
+    <w:p/>
+    <w:p/>
+    <w:p>
+      <w:pPr>
+        <w:pStyle w:val="Heading2"/>
+        <w:numPr>
+          <w:ilvl w:val="1"/>
+          <w:numId w:val="1"/>
+        </w:numPr>
+      </w:pPr>
+      <w:r>
+        <w:t>Determining Isolation Policy</w:t>
+      </w:r>
+    </w:p>
+    <w:p/>
+    <w:p>
+      <w:r>
+        <w:t xml:space="preserve">The isolation status of all individuals is stored in a map. These are used to determine if an individual has already been isolation, in which case they may not need a further isolation applied to them. </w:t>
+      </w:r>
+    </w:p>
+    <w:p/>
+    <w:p/>
+    <w:p/>
+    <w:p>
+      <w:r>
+        <w:rPr>
+          <w:noProof/>
+        </w:rPr>
+        <w:drawing>
+          <wp:inline distT="0" distB="0" distL="0" distR="0">
+            <wp:extent cx="3894992" cy="3471379"/>
+            <wp:effectExtent l="0" t="0" r="4445" b="0"/>
+            <wp:docPr id="12" name="Picture 12"/>
+            <wp:cNvGraphicFramePr>
+              <a:graphicFrameLocks xmlns:a="http://schemas.openxmlformats.org/drawingml/2006/main" noChangeAspect="1"/>
+            </wp:cNvGraphicFramePr>
+            <a:graphic xmlns:a="http://schemas.openxmlformats.org/drawingml/2006/main">
+              <a:graphicData uri="http://schemas.openxmlformats.org/drawingml/2006/picture">
+                <pic:pic xmlns:pic="http://schemas.openxmlformats.org/drawingml/2006/picture">
+                  <pic:nvPicPr>
+                    <pic:cNvPr id="12" name="Screenshot 2020-07-30 at 12.21.31.png"/>
+                    <pic:cNvPicPr/>
+                  </pic:nvPicPr>
+                  <pic:blipFill>
+                    <a:blip r:embed="rId21">
+                      <a:extLst>
+                        <a:ext uri="{28A0092B-C50C-407E-A947-70E740481C1C}">
+                          <a14:useLocalDpi xmlns:a14="http://schemas.microsoft.com/office/drawing/2010/main" val="0"/>
+                        </a:ext>
+                      </a:extLst>
+                    </a:blip>
+                    <a:stretch>
+                      <a:fillRect/>
+                    </a:stretch>
+                  </pic:blipFill>
+                  <pic:spPr>
+                    <a:xfrm>
+                      <a:off x="0" y="0"/>
+                      <a:ext cx="3908752" cy="3483642"/>
+                    </a:xfrm>
+                    <a:prstGeom prst="rect">
+                      <a:avLst/>
+                    </a:prstGeom>
+                  </pic:spPr>
+                </pic:pic>
+              </a:graphicData>
+            </a:graphic>
+          </wp:inline>
+        </w:drawing>
+      </w:r>
+    </w:p>
+    <w:p>
+      <w:r>
+        <w:br w:type="page"/>
+      </w:r>
+      <w:r>
+        <w:rPr>
+          <w:noProof/>
+        </w:rPr>
+        <w:lastRenderedPageBreak/>
+        <w:drawing>
+          <wp:inline distT="0" distB="0" distL="0" distR="0">
+            <wp:extent cx="3195376" cy="4273062"/>
+            <wp:effectExtent l="0" t="0" r="5080" b="0"/>
+            <wp:docPr id="13" name="Picture 13"/>
+            <wp:cNvGraphicFramePr>
+              <a:graphicFrameLocks xmlns:a="http://schemas.openxmlformats.org/drawingml/2006/main" noChangeAspect="1"/>
+            </wp:cNvGraphicFramePr>
+            <a:graphic xmlns:a="http://schemas.openxmlformats.org/drawingml/2006/main">
+              <a:graphicData uri="http://schemas.openxmlformats.org/drawingml/2006/picture">
+                <pic:pic xmlns:pic="http://schemas.openxmlformats.org/drawingml/2006/picture">
+                  <pic:nvPicPr>
+                    <pic:cNvPr id="13" name="Screenshot 2020-07-30 at 12.28.40.png"/>
+                    <pic:cNvPicPr/>
+                  </pic:nvPicPr>
+                  <pic:blipFill>
+                    <a:blip r:embed="rId22">
+                      <a:extLst>
+                        <a:ext uri="{28A0092B-C50C-407E-A947-70E740481C1C}">
+                          <a14:useLocalDpi xmlns:a14="http://schemas.microsoft.com/office/drawing/2010/main" val="0"/>
+                        </a:ext>
+                      </a:extLst>
+                    </a:blip>
+                    <a:stretch>
+                      <a:fillRect/>
+                    </a:stretch>
+                  </pic:blipFill>
+                  <pic:spPr>
+                    <a:xfrm>
+                      <a:off x="0" y="0"/>
+                      <a:ext cx="3203422" cy="4283821"/>
+                    </a:xfrm>
+                    <a:prstGeom prst="rect">
+                      <a:avLst/>
+                    </a:prstGeom>
+                  </pic:spPr>
+                </pic:pic>
+              </a:graphicData>
+            </a:graphic>
+          </wp:inline>
+        </w:drawing>
+      </w:r>
+    </w:p>
+    <w:p/>
+    <w:p>
+      <w:pPr>
+        <w:pStyle w:val="Heading2"/>
+        <w:numPr>
+          <w:ilvl w:val="1"/>
+          <w:numId w:val="1"/>
+        </w:numPr>
+      </w:pPr>
+      <w:r>
+        <w:t>Contact Isolation Policy</w:t>
+      </w:r>
+    </w:p>
+    <w:p>
+      <w:r>
+        <w:t>The contact isolation policy examines the isolation status of two individuals using the above logic to determine if the contact takes place. It then uses the exposure threshold as a high-pass filter to determine if the contact is long enough to expose someone to infection. A Boolean is returned as to</w:t>
+      </w:r>
+      <w:r>
+        <w:t xml:space="preserve"> whether the contact should be considered for evaluation.</w:t>
+      </w:r>
+    </w:p>
+    <w:p/>
+    <w:p>
+      <w:r>
+        <w:rPr>
+          <w:noProof/>
+        </w:rPr>
+        <w:lastRenderedPageBreak/>
+        <w:drawing>
+          <wp:inline distT="0" distB="0" distL="0" distR="0">
+            <wp:extent cx="3481423" cy="4455990"/>
+            <wp:effectExtent l="0" t="0" r="0" b="1905"/>
+            <wp:docPr id="14" name="Picture 14"/>
+            <wp:cNvGraphicFramePr>
+              <a:graphicFrameLocks xmlns:a="http://schemas.openxmlformats.org/drawingml/2006/main" noChangeAspect="1"/>
+            </wp:cNvGraphicFramePr>
+            <a:graphic xmlns:a="http://schemas.openxmlformats.org/drawingml/2006/main">
+              <a:graphicData uri="http://schemas.openxmlformats.org/drawingml/2006/picture">
+                <pic:pic xmlns:pic="http://schemas.openxmlformats.org/drawingml/2006/picture">
+                  <pic:nvPicPr>
+                    <pic:cNvPr id="14" name="Screenshot 2020-07-30 at 13.53.00.png"/>
+                    <pic:cNvPicPr/>
+                  </pic:nvPicPr>
+                  <pic:blipFill>
+                    <a:blip r:embed="rId23">
+                      <a:extLst>
+                        <a:ext uri="{28A0092B-C50C-407E-A947-70E740481C1C}">
+                          <a14:useLocalDpi xmlns:a14="http://schemas.microsoft.com/office/drawing/2010/main" val="0"/>
+                        </a:ext>
+                      </a:extLst>
+                    </a:blip>
+                    <a:stretch>
+                      <a:fillRect/>
+                    </a:stretch>
+                  </pic:blipFill>
+                  <pic:spPr>
+                    <a:xfrm>
+                      <a:off x="0" y="0"/>
+                      <a:ext cx="3493723" cy="4471733"/>
+                    </a:xfrm>
+                    <a:prstGeom prst="rect">
+                      <a:avLst/>
+                    </a:prstGeom>
+                  </pic:spPr>
+                </pic:pic>
+              </a:graphicData>
+            </a:graphic>
+          </wp:inline>
+        </w:drawing>
+      </w:r>
+    </w:p>
+    <w:p>
+      <w:pPr>
+        <w:pStyle w:val="Heading2"/>
+        <w:numPr>
+          <w:ilvl w:val="0"/>
+          <w:numId w:val="1"/>
+        </w:numPr>
+      </w:pPr>
+      <w:r>
+        <w:t>Tracing</w:t>
+      </w:r>
+      <w:r>
+        <w:t xml:space="preserve"> Policy</w:t>
+      </w:r>
+    </w:p>
+    <w:p/>
+    <w:p>
+      <w:bookmarkStart w:id="19" w:name="_GoBack"/>
+      <w:r>
+        <w:t xml:space="preserve">A tracing policy is triggered when an </w:t>
+      </w:r>
+      <w:proofErr w:type="gramStart"/>
+      <w:r>
+        <w:t>individual reports</w:t>
+      </w:r>
+      <w:proofErr w:type="gramEnd"/>
+      <w:r>
+        <w:t xml:space="preserve"> themselves as having symptoms. The policy input has been covered above. A combination of Virus and Alert statuses are used to trigger contact tracing. It is possible to look back through the contacts over a number of days and inform individuals that they should isolate. </w:t>
+      </w:r>
+    </w:p>
+    <w:bookmarkEnd w:id="19"/>
+    <w:p/>
+    <w:p>
+      <w:pPr>
+        <w:rPr>
+          <w:ins w:id="20" w:author="Microsoft Office User" w:date="2020-07-30T09:05:00Z"/>
+        </w:rPr>
+      </w:pPr>
+      <w:r>
+        <w:rPr>
+          <w:noProof/>
+        </w:rPr>
+        <w:drawing>
+          <wp:inline distT="0" distB="0" distL="0" distR="0">
+            <wp:extent cx="3016209" cy="2579077"/>
+            <wp:effectExtent l="0" t="0" r="0" b="0"/>
+            <wp:docPr id="17" name="Picture 17"/>
+            <wp:cNvGraphicFramePr>
+              <a:graphicFrameLocks xmlns:a="http://schemas.openxmlformats.org/drawingml/2006/main" noChangeAspect="1"/>
+            </wp:cNvGraphicFramePr>
+            <a:graphic xmlns:a="http://schemas.openxmlformats.org/drawingml/2006/main">
+              <a:graphicData uri="http://schemas.openxmlformats.org/drawingml/2006/picture">
+                <pic:pic xmlns:pic="http://schemas.openxmlformats.org/drawingml/2006/picture">
+                  <pic:nvPicPr>
+                    <pic:cNvPr id="17" name="CheckForAlert.png"/>
+                    <pic:cNvPicPr/>
+                  </pic:nvPicPr>
+                  <pic:blipFill>
+                    <a:blip r:embed="rId24">
+                      <a:extLst>
+                        <a:ext uri="{28A0092B-C50C-407E-A947-70E740481C1C}">
+                          <a14:useLocalDpi xmlns:a14="http://schemas.microsoft.com/office/drawing/2010/main" val="0"/>
+                        </a:ext>
+                      </a:extLst>
+                    </a:blip>
+                    <a:stretch>
+                      <a:fillRect/>
+                    </a:stretch>
+                  </pic:blipFill>
+                  <pic:spPr>
+                    <a:xfrm>
+                      <a:off x="0" y="0"/>
+                      <a:ext cx="3027576" cy="2588797"/>
+                    </a:xfrm>
+                    <a:prstGeom prst="rect">
+                      <a:avLst/>
+                    </a:prstGeom>
+                  </pic:spPr>
+                </pic:pic>
+              </a:graphicData>
+            </a:graphic>
+          </wp:inline>
+        </w:drawing>
+      </w:r>
+    </w:p>
+    <w:p/>
+    <w:p>
+      <w:pPr>
+        <w:pStyle w:val="Heading2"/>
+        <w:numPr>
+          <w:ilvl w:val="0"/>
+          <w:numId w:val="1"/>
+        </w:numPr>
+      </w:pPr>
+      <w:r>
+        <w:lastRenderedPageBreak/>
         <w:t>Assumptions</w:t>
       </w:r>
     </w:p>
@@ -4434,42 +3985,6 @@
       </w:pPr>
       <w:r>
         <w:t>At present, contacts do not use the compliance field and obey alert status absolutely.</w:t>
-      </w:r>
-    </w:p>
-    <w:p>
-      <w:pPr>
-        <w:pStyle w:val="ListParagraph"/>
-        <w:numPr>
-          <w:ilvl w:val="0"/>
-          <w:numId w:val="6"/>
-        </w:numPr>
-      </w:pPr>
-      <w:r>
-        <w:t>A negative test sends the alert status back to NONE.</w:t>
-      </w:r>
-    </w:p>
-    <w:p>
-      <w:pPr>
-        <w:pStyle w:val="ListParagraph"/>
-        <w:numPr>
-          <w:ilvl w:val="0"/>
-          <w:numId w:val="6"/>
-        </w:numPr>
-      </w:pPr>
-      <w:r>
-        <w:t>Alerts currently go back through all time</w:t>
-      </w:r>
-    </w:p>
-    <w:p>
-      <w:pPr>
-        <w:pStyle w:val="ListParagraph"/>
-        <w:numPr>
-          <w:ilvl w:val="0"/>
-          <w:numId w:val="6"/>
-        </w:numPr>
-      </w:pPr>
-      <w:r>
-        <w:t>A negative test sets the status back to NONE</w:t>
       </w:r>
     </w:p>
     <w:p>
@@ -4554,6 +4069,353 @@
 <file path=word/numbering.xml><?xml version="1.0" encoding="utf-8"?>
 <w:numbering xmlns:wpc="http://schemas.microsoft.com/office/word/2010/wordprocessingCanvas" xmlns:cx="http://schemas.microsoft.com/office/drawing/2014/chartex" xmlns:cx1="http://schemas.microsoft.com/office/drawing/2015/9/8/chartex" xmlns:cx2="http://schemas.microsoft.com/office/drawing/2015/10/21/chartex" xmlns:cx3="http://schemas.microsoft.com/office/drawing/2016/5/9/chartex" xmlns:cx4="http://schemas.microsoft.com/office/drawing/2016/5/10/chartex" xmlns:cx5="http://schemas.microsoft.com/office/drawing/2016/5/11/chartex" xmlns:cx6="http://schemas.microsoft.com/office/drawing/2016/5/12/chartex" xmlns:cx7="http://schemas.microsoft.com/office/drawing/2016/5/13/chartex" xmlns:cx8="http://schemas.microsoft.com/office/drawing/2016/5/14/chartex" xmlns:mc="http://schemas.openxmlformats.org/markup-compatibility/2006" xmlns:aink="http://schemas.microsoft.com/office/drawing/2016/ink" xmlns:am3d="http://schemas.microsoft.com/office/drawing/2017/model3d" xmlns:o="urn:schemas-microsoft-com:office:office" xmlns:r="http://schemas.openxmlformats.org/officeDocument/2006/relationships" xmlns:m="http://schemas.openxmlformats.org/officeDocument/2006/math" xmlns:v="urn:schemas-microsoft-com:vml" xmlns:wp14="http://schemas.microsoft.com/office/word/2010/wordprocessingDrawing" xmlns:wp="http://schemas.openxmlformats.org/drawingml/2006/wordprocessingDrawing" xmlns:w10="urn:schemas-microsoft-com:office:word" xmlns:w="http://schemas.openxmlformats.org/wordprocessingml/2006/main" xmlns:w14="http://schemas.microsoft.com/office/word/2010/wordml" xmlns:w15="http://schemas.microsoft.com/office/word/2012/wordml" xmlns:w16cid="http://schemas.microsoft.com/office/word/2016/wordml/cid" xmlns:w16se="http://schemas.microsoft.com/office/word/2015/wordml/symex" xmlns:wpg="http://schemas.microsoft.com/office/word/2010/wordprocessingGroup" xmlns:wpi="http://schemas.microsoft.com/office/word/2010/wordprocessingInk" xmlns:wne="http://schemas.microsoft.com/office/word/2006/wordml" xmlns:wps="http://schemas.microsoft.com/office/word/2010/wordprocessingShape" mc:Ignorable="w14 w15 w16se w16cid wp14">
   <w:abstractNum w:abstractNumId="0" w15:restartNumberingAfterBreak="0">
+    <w:nsid w:val="023138D5"/>
+    <w:multiLevelType w:val="multilevel"/>
+    <w:tmpl w:val="0409001F"/>
+    <w:lvl w:ilvl="0">
+      <w:start w:val="1"/>
+      <w:numFmt w:val="decimal"/>
+      <w:lvlText w:val="%1."/>
+      <w:lvlJc w:val="left"/>
+      <w:pPr>
+        <w:ind w:left="360" w:hanging="360"/>
+      </w:pPr>
+    </w:lvl>
+    <w:lvl w:ilvl="1">
+      <w:start w:val="1"/>
+      <w:numFmt w:val="decimal"/>
+      <w:lvlText w:val="%1.%2."/>
+      <w:lvlJc w:val="left"/>
+      <w:pPr>
+        <w:ind w:left="792" w:hanging="432"/>
+      </w:pPr>
+    </w:lvl>
+    <w:lvl w:ilvl="2">
+      <w:start w:val="1"/>
+      <w:numFmt w:val="decimal"/>
+      <w:lvlText w:val="%1.%2.%3."/>
+      <w:lvlJc w:val="left"/>
+      <w:pPr>
+        <w:ind w:left="1224" w:hanging="504"/>
+      </w:pPr>
+    </w:lvl>
+    <w:lvl w:ilvl="3">
+      <w:start w:val="1"/>
+      <w:numFmt w:val="decimal"/>
+      <w:lvlText w:val="%1.%2.%3.%4."/>
+      <w:lvlJc w:val="left"/>
+      <w:pPr>
+        <w:ind w:left="1728" w:hanging="648"/>
+      </w:pPr>
+    </w:lvl>
+    <w:lvl w:ilvl="4">
+      <w:start w:val="1"/>
+      <w:numFmt w:val="decimal"/>
+      <w:lvlText w:val="%1.%2.%3.%4.%5."/>
+      <w:lvlJc w:val="left"/>
+      <w:pPr>
+        <w:ind w:left="2232" w:hanging="792"/>
+      </w:pPr>
+    </w:lvl>
+    <w:lvl w:ilvl="5">
+      <w:start w:val="1"/>
+      <w:numFmt w:val="decimal"/>
+      <w:lvlText w:val="%1.%2.%3.%4.%5.%6."/>
+      <w:lvlJc w:val="left"/>
+      <w:pPr>
+        <w:ind w:left="2736" w:hanging="936"/>
+      </w:pPr>
+    </w:lvl>
+    <w:lvl w:ilvl="6">
+      <w:start w:val="1"/>
+      <w:numFmt w:val="decimal"/>
+      <w:lvlText w:val="%1.%2.%3.%4.%5.%6.%7."/>
+      <w:lvlJc w:val="left"/>
+      <w:pPr>
+        <w:ind w:left="3240" w:hanging="1080"/>
+      </w:pPr>
+    </w:lvl>
+    <w:lvl w:ilvl="7">
+      <w:start w:val="1"/>
+      <w:numFmt w:val="decimal"/>
+      <w:lvlText w:val="%1.%2.%3.%4.%5.%6.%7.%8."/>
+      <w:lvlJc w:val="left"/>
+      <w:pPr>
+        <w:ind w:left="3744" w:hanging="1224"/>
+      </w:pPr>
+    </w:lvl>
+    <w:lvl w:ilvl="8">
+      <w:start w:val="1"/>
+      <w:numFmt w:val="decimal"/>
+      <w:lvlText w:val="%1.%2.%3.%4.%5.%6.%7.%8.%9."/>
+      <w:lvlJc w:val="left"/>
+      <w:pPr>
+        <w:ind w:left="4320" w:hanging="1440"/>
+      </w:pPr>
+    </w:lvl>
+  </w:abstractNum>
+  <w:abstractNum w:abstractNumId="1" w15:restartNumberingAfterBreak="0">
+    <w:nsid w:val="04A02F9B"/>
+    <w:multiLevelType w:val="multilevel"/>
+    <w:tmpl w:val="0409001F"/>
+    <w:lvl w:ilvl="0">
+      <w:start w:val="1"/>
+      <w:numFmt w:val="decimal"/>
+      <w:lvlText w:val="%1."/>
+      <w:lvlJc w:val="left"/>
+      <w:pPr>
+        <w:ind w:left="360" w:hanging="360"/>
+      </w:pPr>
+    </w:lvl>
+    <w:lvl w:ilvl="1">
+      <w:start w:val="1"/>
+      <w:numFmt w:val="decimal"/>
+      <w:lvlText w:val="%1.%2."/>
+      <w:lvlJc w:val="left"/>
+      <w:pPr>
+        <w:ind w:left="792" w:hanging="432"/>
+      </w:pPr>
+    </w:lvl>
+    <w:lvl w:ilvl="2">
+      <w:start w:val="1"/>
+      <w:numFmt w:val="decimal"/>
+      <w:lvlText w:val="%1.%2.%3."/>
+      <w:lvlJc w:val="left"/>
+      <w:pPr>
+        <w:ind w:left="1224" w:hanging="504"/>
+      </w:pPr>
+    </w:lvl>
+    <w:lvl w:ilvl="3">
+      <w:start w:val="1"/>
+      <w:numFmt w:val="decimal"/>
+      <w:lvlText w:val="%1.%2.%3.%4."/>
+      <w:lvlJc w:val="left"/>
+      <w:pPr>
+        <w:ind w:left="1728" w:hanging="648"/>
+      </w:pPr>
+    </w:lvl>
+    <w:lvl w:ilvl="4">
+      <w:start w:val="1"/>
+      <w:numFmt w:val="decimal"/>
+      <w:lvlText w:val="%1.%2.%3.%4.%5."/>
+      <w:lvlJc w:val="left"/>
+      <w:pPr>
+        <w:ind w:left="2232" w:hanging="792"/>
+      </w:pPr>
+    </w:lvl>
+    <w:lvl w:ilvl="5">
+      <w:start w:val="1"/>
+      <w:numFmt w:val="decimal"/>
+      <w:lvlText w:val="%1.%2.%3.%4.%5.%6."/>
+      <w:lvlJc w:val="left"/>
+      <w:pPr>
+        <w:ind w:left="2736" w:hanging="936"/>
+      </w:pPr>
+    </w:lvl>
+    <w:lvl w:ilvl="6">
+      <w:start w:val="1"/>
+      <w:numFmt w:val="decimal"/>
+      <w:lvlText w:val="%1.%2.%3.%4.%5.%6.%7."/>
+      <w:lvlJc w:val="left"/>
+      <w:pPr>
+        <w:ind w:left="3240" w:hanging="1080"/>
+      </w:pPr>
+    </w:lvl>
+    <w:lvl w:ilvl="7">
+      <w:start w:val="1"/>
+      <w:numFmt w:val="decimal"/>
+      <w:lvlText w:val="%1.%2.%3.%4.%5.%6.%7.%8."/>
+      <w:lvlJc w:val="left"/>
+      <w:pPr>
+        <w:ind w:left="3744" w:hanging="1224"/>
+      </w:pPr>
+    </w:lvl>
+    <w:lvl w:ilvl="8">
+      <w:start w:val="1"/>
+      <w:numFmt w:val="decimal"/>
+      <w:lvlText w:val="%1.%2.%3.%4.%5.%6.%7.%8.%9."/>
+      <w:lvlJc w:val="left"/>
+      <w:pPr>
+        <w:ind w:left="4320" w:hanging="1440"/>
+      </w:pPr>
+    </w:lvl>
+  </w:abstractNum>
+  <w:abstractNum w:abstractNumId="2" w15:restartNumberingAfterBreak="0">
+    <w:nsid w:val="09E37450"/>
+    <w:multiLevelType w:val="hybridMultilevel"/>
+    <w:tmpl w:val="5EFA1B76"/>
+    <w:lvl w:ilvl="0" w:tplc="0409000F">
+      <w:start w:val="1"/>
+      <w:numFmt w:val="decimal"/>
+      <w:lvlText w:val="%1."/>
+      <w:lvlJc w:val="left"/>
+      <w:pPr>
+        <w:ind w:left="720" w:hanging="360"/>
+      </w:pPr>
+      <w:rPr>
+        <w:rFonts w:hint="default"/>
+      </w:rPr>
+    </w:lvl>
+    <w:lvl w:ilvl="1" w:tplc="04090019" w:tentative="1">
+      <w:start w:val="1"/>
+      <w:numFmt w:val="lowerLetter"/>
+      <w:lvlText w:val="%2."/>
+      <w:lvlJc w:val="left"/>
+      <w:pPr>
+        <w:ind w:left="1440" w:hanging="360"/>
+      </w:pPr>
+    </w:lvl>
+    <w:lvl w:ilvl="2" w:tplc="0409001B" w:tentative="1">
+      <w:start w:val="1"/>
+      <w:numFmt w:val="lowerRoman"/>
+      <w:lvlText w:val="%3."/>
+      <w:lvlJc w:val="right"/>
+      <w:pPr>
+        <w:ind w:left="2160" w:hanging="180"/>
+      </w:pPr>
+    </w:lvl>
+    <w:lvl w:ilvl="3" w:tplc="0409000F" w:tentative="1">
+      <w:start w:val="1"/>
+      <w:numFmt w:val="decimal"/>
+      <w:lvlText w:val="%4."/>
+      <w:lvlJc w:val="left"/>
+      <w:pPr>
+        <w:ind w:left="2880" w:hanging="360"/>
+      </w:pPr>
+    </w:lvl>
+    <w:lvl w:ilvl="4" w:tplc="04090019" w:tentative="1">
+      <w:start w:val="1"/>
+      <w:numFmt w:val="lowerLetter"/>
+      <w:lvlText w:val="%5."/>
+      <w:lvlJc w:val="left"/>
+      <w:pPr>
+        <w:ind w:left="3600" w:hanging="360"/>
+      </w:pPr>
+    </w:lvl>
+    <w:lvl w:ilvl="5" w:tplc="0409001B" w:tentative="1">
+      <w:start w:val="1"/>
+      <w:numFmt w:val="lowerRoman"/>
+      <w:lvlText w:val="%6."/>
+      <w:lvlJc w:val="right"/>
+      <w:pPr>
+        <w:ind w:left="4320" w:hanging="180"/>
+      </w:pPr>
+    </w:lvl>
+    <w:lvl w:ilvl="6" w:tplc="0409000F" w:tentative="1">
+      <w:start w:val="1"/>
+      <w:numFmt w:val="decimal"/>
+      <w:lvlText w:val="%7."/>
+      <w:lvlJc w:val="left"/>
+      <w:pPr>
+        <w:ind w:left="5040" w:hanging="360"/>
+      </w:pPr>
+    </w:lvl>
+    <w:lvl w:ilvl="7" w:tplc="04090019" w:tentative="1">
+      <w:start w:val="1"/>
+      <w:numFmt w:val="lowerLetter"/>
+      <w:lvlText w:val="%8."/>
+      <w:lvlJc w:val="left"/>
+      <w:pPr>
+        <w:ind w:left="5760" w:hanging="360"/>
+      </w:pPr>
+    </w:lvl>
+    <w:lvl w:ilvl="8" w:tplc="0409001B" w:tentative="1">
+      <w:start w:val="1"/>
+      <w:numFmt w:val="lowerRoman"/>
+      <w:lvlText w:val="%9."/>
+      <w:lvlJc w:val="right"/>
+      <w:pPr>
+        <w:ind w:left="6480" w:hanging="180"/>
+      </w:pPr>
+    </w:lvl>
+  </w:abstractNum>
+  <w:abstractNum w:abstractNumId="3" w15:restartNumberingAfterBreak="0">
+    <w:nsid w:val="0BF869BC"/>
+    <w:multiLevelType w:val="multilevel"/>
+    <w:tmpl w:val="0409001F"/>
+    <w:lvl w:ilvl="0">
+      <w:start w:val="1"/>
+      <w:numFmt w:val="decimal"/>
+      <w:lvlText w:val="%1."/>
+      <w:lvlJc w:val="left"/>
+      <w:pPr>
+        <w:ind w:left="360" w:hanging="360"/>
+      </w:pPr>
+    </w:lvl>
+    <w:lvl w:ilvl="1">
+      <w:start w:val="1"/>
+      <w:numFmt w:val="decimal"/>
+      <w:lvlText w:val="%1.%2."/>
+      <w:lvlJc w:val="left"/>
+      <w:pPr>
+        <w:ind w:left="792" w:hanging="432"/>
+      </w:pPr>
+    </w:lvl>
+    <w:lvl w:ilvl="2">
+      <w:start w:val="1"/>
+      <w:numFmt w:val="decimal"/>
+      <w:lvlText w:val="%1.%2.%3."/>
+      <w:lvlJc w:val="left"/>
+      <w:pPr>
+        <w:ind w:left="1224" w:hanging="504"/>
+      </w:pPr>
+    </w:lvl>
+    <w:lvl w:ilvl="3">
+      <w:start w:val="1"/>
+      <w:numFmt w:val="decimal"/>
+      <w:lvlText w:val="%1.%2.%3.%4."/>
+      <w:lvlJc w:val="left"/>
+      <w:pPr>
+        <w:ind w:left="1728" w:hanging="648"/>
+      </w:pPr>
+    </w:lvl>
+    <w:lvl w:ilvl="4">
+      <w:start w:val="1"/>
+      <w:numFmt w:val="decimal"/>
+      <w:lvlText w:val="%1.%2.%3.%4.%5."/>
+      <w:lvlJc w:val="left"/>
+      <w:pPr>
+        <w:ind w:left="2232" w:hanging="792"/>
+      </w:pPr>
+    </w:lvl>
+    <w:lvl w:ilvl="5">
+      <w:start w:val="1"/>
+      <w:numFmt w:val="decimal"/>
+      <w:lvlText w:val="%1.%2.%3.%4.%5.%6."/>
+      <w:lvlJc w:val="left"/>
+      <w:pPr>
+        <w:ind w:left="2736" w:hanging="936"/>
+      </w:pPr>
+    </w:lvl>
+    <w:lvl w:ilvl="6">
+      <w:start w:val="1"/>
+      <w:numFmt w:val="decimal"/>
+      <w:lvlText w:val="%1.%2.%3.%4.%5.%6.%7."/>
+      <w:lvlJc w:val="left"/>
+      <w:pPr>
+        <w:ind w:left="3240" w:hanging="1080"/>
+      </w:pPr>
+    </w:lvl>
+    <w:lvl w:ilvl="7">
+      <w:start w:val="1"/>
+      <w:numFmt w:val="decimal"/>
+      <w:lvlText w:val="%1.%2.%3.%4.%5.%6.%7.%8."/>
+      <w:lvlJc w:val="left"/>
+      <w:pPr>
+        <w:ind w:left="3744" w:hanging="1224"/>
+      </w:pPr>
+    </w:lvl>
+    <w:lvl w:ilvl="8">
+      <w:start w:val="1"/>
+      <w:numFmt w:val="decimal"/>
+      <w:lvlText w:val="%1.%2.%3.%4.%5.%6.%7.%8.%9."/>
+      <w:lvlJc w:val="left"/>
+      <w:pPr>
+        <w:ind w:left="4320" w:hanging="1440"/>
+      </w:pPr>
+    </w:lvl>
+  </w:abstractNum>
+  <w:abstractNum w:abstractNumId="4" w15:restartNumberingAfterBreak="0">
     <w:nsid w:val="0FC105DD"/>
     <w:multiLevelType w:val="multilevel"/>
     <w:tmpl w:val="0409001F"/>
@@ -4639,7 +4501,7 @@
       </w:pPr>
     </w:lvl>
   </w:abstractNum>
-  <w:abstractNum w:abstractNumId="1" w15:restartNumberingAfterBreak="0">
+  <w:abstractNum w:abstractNumId="5" w15:restartNumberingAfterBreak="0">
     <w:nsid w:val="18F52C81"/>
     <w:multiLevelType w:val="hybridMultilevel"/>
     <w:tmpl w:val="F4CA9EB8"/>
@@ -4752,7 +4614,7 @@
       </w:rPr>
     </w:lvl>
   </w:abstractNum>
-  <w:abstractNum w:abstractNumId="2" w15:restartNumberingAfterBreak="0">
+  <w:abstractNum w:abstractNumId="6" w15:restartNumberingAfterBreak="0">
     <w:nsid w:val="1924425B"/>
     <w:multiLevelType w:val="multilevel"/>
     <w:tmpl w:val="0409001F"/>
@@ -4838,7 +4700,7 @@
       </w:pPr>
     </w:lvl>
   </w:abstractNum>
-  <w:abstractNum w:abstractNumId="3" w15:restartNumberingAfterBreak="0">
+  <w:abstractNum w:abstractNumId="7" w15:restartNumberingAfterBreak="0">
     <w:nsid w:val="2CEE72D9"/>
     <w:multiLevelType w:val="hybridMultilevel"/>
     <w:tmpl w:val="5FBC4212"/>
@@ -4951,7 +4813,7 @@
       </w:rPr>
     </w:lvl>
   </w:abstractNum>
-  <w:abstractNum w:abstractNumId="4" w15:restartNumberingAfterBreak="0">
+  <w:abstractNum w:abstractNumId="8" w15:restartNumberingAfterBreak="0">
     <w:nsid w:val="45B3145E"/>
     <w:multiLevelType w:val="multilevel"/>
     <w:tmpl w:val="0409001F"/>
@@ -5037,7 +4899,7 @@
       </w:pPr>
     </w:lvl>
   </w:abstractNum>
-  <w:abstractNum w:abstractNumId="5" w15:restartNumberingAfterBreak="0">
+  <w:abstractNum w:abstractNumId="9" w15:restartNumberingAfterBreak="0">
     <w:nsid w:val="4B7A565F"/>
     <w:multiLevelType w:val="multilevel"/>
     <w:tmpl w:val="0409001F"/>
@@ -5123,7 +4985,7 @@
       </w:pPr>
     </w:lvl>
   </w:abstractNum>
-  <w:abstractNum w:abstractNumId="6" w15:restartNumberingAfterBreak="0">
+  <w:abstractNum w:abstractNumId="10" w15:restartNumberingAfterBreak="0">
     <w:nsid w:val="518B7C5C"/>
     <w:multiLevelType w:val="multilevel"/>
     <w:tmpl w:val="0409001F"/>
@@ -5209,7 +5071,182 @@
       </w:pPr>
     </w:lvl>
   </w:abstractNum>
-  <w:abstractNum w:abstractNumId="7" w15:restartNumberingAfterBreak="0">
+  <w:abstractNum w:abstractNumId="11" w15:restartNumberingAfterBreak="0">
+    <w:nsid w:val="52A97413"/>
+    <w:multiLevelType w:val="multilevel"/>
+    <w:tmpl w:val="0409001F"/>
+    <w:lvl w:ilvl="0">
+      <w:start w:val="1"/>
+      <w:numFmt w:val="decimal"/>
+      <w:lvlText w:val="%1."/>
+      <w:lvlJc w:val="left"/>
+      <w:pPr>
+        <w:ind w:left="360" w:hanging="360"/>
+      </w:pPr>
+    </w:lvl>
+    <w:lvl w:ilvl="1">
+      <w:start w:val="1"/>
+      <w:numFmt w:val="decimal"/>
+      <w:lvlText w:val="%1.%2."/>
+      <w:lvlJc w:val="left"/>
+      <w:pPr>
+        <w:ind w:left="792" w:hanging="432"/>
+      </w:pPr>
+    </w:lvl>
+    <w:lvl w:ilvl="2">
+      <w:start w:val="1"/>
+      <w:numFmt w:val="decimal"/>
+      <w:lvlText w:val="%1.%2.%3."/>
+      <w:lvlJc w:val="left"/>
+      <w:pPr>
+        <w:ind w:left="1224" w:hanging="504"/>
+      </w:pPr>
+    </w:lvl>
+    <w:lvl w:ilvl="3">
+      <w:start w:val="1"/>
+      <w:numFmt w:val="decimal"/>
+      <w:lvlText w:val="%1.%2.%3.%4."/>
+      <w:lvlJc w:val="left"/>
+      <w:pPr>
+        <w:ind w:left="1728" w:hanging="648"/>
+      </w:pPr>
+    </w:lvl>
+    <w:lvl w:ilvl="4">
+      <w:start w:val="1"/>
+      <w:numFmt w:val="decimal"/>
+      <w:lvlText w:val="%1.%2.%3.%4.%5."/>
+      <w:lvlJc w:val="left"/>
+      <w:pPr>
+        <w:ind w:left="2232" w:hanging="792"/>
+      </w:pPr>
+    </w:lvl>
+    <w:lvl w:ilvl="5">
+      <w:start w:val="1"/>
+      <w:numFmt w:val="decimal"/>
+      <w:lvlText w:val="%1.%2.%3.%4.%5.%6."/>
+      <w:lvlJc w:val="left"/>
+      <w:pPr>
+        <w:ind w:left="2736" w:hanging="936"/>
+      </w:pPr>
+    </w:lvl>
+    <w:lvl w:ilvl="6">
+      <w:start w:val="1"/>
+      <w:numFmt w:val="decimal"/>
+      <w:lvlText w:val="%1.%2.%3.%4.%5.%6.%7."/>
+      <w:lvlJc w:val="left"/>
+      <w:pPr>
+        <w:ind w:left="3240" w:hanging="1080"/>
+      </w:pPr>
+    </w:lvl>
+    <w:lvl w:ilvl="7">
+      <w:start w:val="1"/>
+      <w:numFmt w:val="decimal"/>
+      <w:lvlText w:val="%1.%2.%3.%4.%5.%6.%7.%8."/>
+      <w:lvlJc w:val="left"/>
+      <w:pPr>
+        <w:ind w:left="3744" w:hanging="1224"/>
+      </w:pPr>
+    </w:lvl>
+    <w:lvl w:ilvl="8">
+      <w:start w:val="1"/>
+      <w:numFmt w:val="decimal"/>
+      <w:lvlText w:val="%1.%2.%3.%4.%5.%6.%7.%8.%9."/>
+      <w:lvlJc w:val="left"/>
+      <w:pPr>
+        <w:ind w:left="4320" w:hanging="1440"/>
+      </w:pPr>
+    </w:lvl>
+  </w:abstractNum>
+  <w:abstractNum w:abstractNumId="12" w15:restartNumberingAfterBreak="0">
+    <w:nsid w:val="55F85FB3"/>
+    <w:multiLevelType w:val="hybridMultilevel"/>
+    <w:tmpl w:val="5EFA1B76"/>
+    <w:lvl w:ilvl="0" w:tplc="0409000F">
+      <w:start w:val="1"/>
+      <w:numFmt w:val="decimal"/>
+      <w:lvlText w:val="%1."/>
+      <w:lvlJc w:val="left"/>
+      <w:pPr>
+        <w:ind w:left="720" w:hanging="360"/>
+      </w:pPr>
+      <w:rPr>
+        <w:rFonts w:hint="default"/>
+      </w:rPr>
+    </w:lvl>
+    <w:lvl w:ilvl="1" w:tplc="04090019" w:tentative="1">
+      <w:start w:val="1"/>
+      <w:numFmt w:val="lowerLetter"/>
+      <w:lvlText w:val="%2."/>
+      <w:lvlJc w:val="left"/>
+      <w:pPr>
+        <w:ind w:left="1440" w:hanging="360"/>
+      </w:pPr>
+    </w:lvl>
+    <w:lvl w:ilvl="2" w:tplc="0409001B" w:tentative="1">
+      <w:start w:val="1"/>
+      <w:numFmt w:val="lowerRoman"/>
+      <w:lvlText w:val="%3."/>
+      <w:lvlJc w:val="right"/>
+      <w:pPr>
+        <w:ind w:left="2160" w:hanging="180"/>
+      </w:pPr>
+    </w:lvl>
+    <w:lvl w:ilvl="3" w:tplc="0409000F" w:tentative="1">
+      <w:start w:val="1"/>
+      <w:numFmt w:val="decimal"/>
+      <w:lvlText w:val="%4."/>
+      <w:lvlJc w:val="left"/>
+      <w:pPr>
+        <w:ind w:left="2880" w:hanging="360"/>
+      </w:pPr>
+    </w:lvl>
+    <w:lvl w:ilvl="4" w:tplc="04090019" w:tentative="1">
+      <w:start w:val="1"/>
+      <w:numFmt w:val="lowerLetter"/>
+      <w:lvlText w:val="%5."/>
+      <w:lvlJc w:val="left"/>
+      <w:pPr>
+        <w:ind w:left="3600" w:hanging="360"/>
+      </w:pPr>
+    </w:lvl>
+    <w:lvl w:ilvl="5" w:tplc="0409001B" w:tentative="1">
+      <w:start w:val="1"/>
+      <w:numFmt w:val="lowerRoman"/>
+      <w:lvlText w:val="%6."/>
+      <w:lvlJc w:val="right"/>
+      <w:pPr>
+        <w:ind w:left="4320" w:hanging="180"/>
+      </w:pPr>
+    </w:lvl>
+    <w:lvl w:ilvl="6" w:tplc="0409000F" w:tentative="1">
+      <w:start w:val="1"/>
+      <w:numFmt w:val="decimal"/>
+      <w:lvlText w:val="%7."/>
+      <w:lvlJc w:val="left"/>
+      <w:pPr>
+        <w:ind w:left="5040" w:hanging="360"/>
+      </w:pPr>
+    </w:lvl>
+    <w:lvl w:ilvl="7" w:tplc="04090019" w:tentative="1">
+      <w:start w:val="1"/>
+      <w:numFmt w:val="lowerLetter"/>
+      <w:lvlText w:val="%8."/>
+      <w:lvlJc w:val="left"/>
+      <w:pPr>
+        <w:ind w:left="5760" w:hanging="360"/>
+      </w:pPr>
+    </w:lvl>
+    <w:lvl w:ilvl="8" w:tplc="0409001B" w:tentative="1">
+      <w:start w:val="1"/>
+      <w:numFmt w:val="lowerRoman"/>
+      <w:lvlText w:val="%9."/>
+      <w:lvlJc w:val="right"/>
+      <w:pPr>
+        <w:ind w:left="6480" w:hanging="180"/>
+      </w:pPr>
+    </w:lvl>
+  </w:abstractNum>
+  <w:abstractNum w:abstractNumId="13" w15:restartNumberingAfterBreak="0">
     <w:nsid w:val="575E735F"/>
     <w:multiLevelType w:val="hybridMultilevel"/>
     <w:tmpl w:val="CD5E0F0C"/>
@@ -5322,7 +5359,7 @@
       </w:rPr>
     </w:lvl>
   </w:abstractNum>
-  <w:abstractNum w:abstractNumId="8" w15:restartNumberingAfterBreak="0">
+  <w:abstractNum w:abstractNumId="14" w15:restartNumberingAfterBreak="0">
     <w:nsid w:val="578D0A19"/>
     <w:multiLevelType w:val="multilevel"/>
     <w:tmpl w:val="0409001F"/>
@@ -5408,7 +5445,7 @@
       </w:pPr>
     </w:lvl>
   </w:abstractNum>
-  <w:abstractNum w:abstractNumId="9" w15:restartNumberingAfterBreak="0">
+  <w:abstractNum w:abstractNumId="15" w15:restartNumberingAfterBreak="0">
     <w:nsid w:val="66324A9E"/>
     <w:multiLevelType w:val="multilevel"/>
     <w:tmpl w:val="0409001F"/>
@@ -5494,7 +5531,93 @@
       </w:pPr>
     </w:lvl>
   </w:abstractNum>
-  <w:abstractNum w:abstractNumId="10" w15:restartNumberingAfterBreak="0">
+  <w:abstractNum w:abstractNumId="16" w15:restartNumberingAfterBreak="0">
+    <w:nsid w:val="6C1B191F"/>
+    <w:multiLevelType w:val="multilevel"/>
+    <w:tmpl w:val="0409001F"/>
+    <w:lvl w:ilvl="0">
+      <w:start w:val="1"/>
+      <w:numFmt w:val="decimal"/>
+      <w:lvlText w:val="%1."/>
+      <w:lvlJc w:val="left"/>
+      <w:pPr>
+        <w:ind w:left="360" w:hanging="360"/>
+      </w:pPr>
+    </w:lvl>
+    <w:lvl w:ilvl="1">
+      <w:start w:val="1"/>
+      <w:numFmt w:val="decimal"/>
+      <w:lvlText w:val="%1.%2."/>
+      <w:lvlJc w:val="left"/>
+      <w:pPr>
+        <w:ind w:left="792" w:hanging="432"/>
+      </w:pPr>
+    </w:lvl>
+    <w:lvl w:ilvl="2">
+      <w:start w:val="1"/>
+      <w:numFmt w:val="decimal"/>
+      <w:lvlText w:val="%1.%2.%3."/>
+      <w:lvlJc w:val="left"/>
+      <w:pPr>
+        <w:ind w:left="1224" w:hanging="504"/>
+      </w:pPr>
+    </w:lvl>
+    <w:lvl w:ilvl="3">
+      <w:start w:val="1"/>
+      <w:numFmt w:val="decimal"/>
+      <w:lvlText w:val="%1.%2.%3.%4."/>
+      <w:lvlJc w:val="left"/>
+      <w:pPr>
+        <w:ind w:left="1728" w:hanging="648"/>
+      </w:pPr>
+    </w:lvl>
+    <w:lvl w:ilvl="4">
+      <w:start w:val="1"/>
+      <w:numFmt w:val="decimal"/>
+      <w:lvlText w:val="%1.%2.%3.%4.%5."/>
+      <w:lvlJc w:val="left"/>
+      <w:pPr>
+        <w:ind w:left="2232" w:hanging="792"/>
+      </w:pPr>
+    </w:lvl>
+    <w:lvl w:ilvl="5">
+      <w:start w:val="1"/>
+      <w:numFmt w:val="decimal"/>
+      <w:lvlText w:val="%1.%2.%3.%4.%5.%6."/>
+      <w:lvlJc w:val="left"/>
+      <w:pPr>
+        <w:ind w:left="2736" w:hanging="936"/>
+      </w:pPr>
+    </w:lvl>
+    <w:lvl w:ilvl="6">
+      <w:start w:val="1"/>
+      <w:numFmt w:val="decimal"/>
+      <w:lvlText w:val="%1.%2.%3.%4.%5.%6.%7."/>
+      <w:lvlJc w:val="left"/>
+      <w:pPr>
+        <w:ind w:left="3240" w:hanging="1080"/>
+      </w:pPr>
+    </w:lvl>
+    <w:lvl w:ilvl="7">
+      <w:start w:val="1"/>
+      <w:numFmt w:val="decimal"/>
+      <w:lvlText w:val="%1.%2.%3.%4.%5.%6.%7.%8."/>
+      <w:lvlJc w:val="left"/>
+      <w:pPr>
+        <w:ind w:left="3744" w:hanging="1224"/>
+      </w:pPr>
+    </w:lvl>
+    <w:lvl w:ilvl="8">
+      <w:start w:val="1"/>
+      <w:numFmt w:val="decimal"/>
+      <w:lvlText w:val="%1.%2.%3.%4.%5.%6.%7.%8.%9."/>
+      <w:lvlJc w:val="left"/>
+      <w:pPr>
+        <w:ind w:left="4320" w:hanging="1440"/>
+      </w:pPr>
+    </w:lvl>
+  </w:abstractNum>
+  <w:abstractNum w:abstractNumId="17" w15:restartNumberingAfterBreak="0">
     <w:nsid w:val="7BA82795"/>
     <w:multiLevelType w:val="multilevel"/>
     <w:tmpl w:val="0409001F"/>
@@ -5581,37 +5704,58 @@
     </w:lvl>
   </w:abstractNum>
   <w:num w:numId="1">
+    <w:abstractNumId w:val="9"/>
+  </w:num>
+  <w:num w:numId="2">
+    <w:abstractNumId w:val="14"/>
+  </w:num>
+  <w:num w:numId="3">
+    <w:abstractNumId w:val="4"/>
+  </w:num>
+  <w:num w:numId="4">
+    <w:abstractNumId w:val="10"/>
+  </w:num>
+  <w:num w:numId="5">
+    <w:abstractNumId w:val="15"/>
+  </w:num>
+  <w:num w:numId="6">
+    <w:abstractNumId w:val="13"/>
+  </w:num>
+  <w:num w:numId="7">
+    <w:abstractNumId w:val="7"/>
+  </w:num>
+  <w:num w:numId="8">
     <w:abstractNumId w:val="5"/>
   </w:num>
-  <w:num w:numId="2">
+  <w:num w:numId="9">
+    <w:abstractNumId w:val="6"/>
+  </w:num>
+  <w:num w:numId="10">
+    <w:abstractNumId w:val="17"/>
+  </w:num>
+  <w:num w:numId="11">
     <w:abstractNumId w:val="8"/>
   </w:num>
-  <w:num w:numId="3">
+  <w:num w:numId="12">
+    <w:abstractNumId w:val="2"/>
+  </w:num>
+  <w:num w:numId="13">
+    <w:abstractNumId w:val="12"/>
+  </w:num>
+  <w:num w:numId="14">
     <w:abstractNumId w:val="0"/>
   </w:num>
-  <w:num w:numId="4">
-    <w:abstractNumId w:val="6"/>
+  <w:num w:numId="15">
+    <w:abstractNumId w:val="16"/>
   </w:num>
-  <w:num w:numId="5">
-    <w:abstractNumId w:val="9"/>
+  <w:num w:numId="16">
+    <w:abstractNumId w:val="1"/>
   </w:num>
-  <w:num w:numId="6">
-    <w:abstractNumId w:val="7"/>
-  </w:num>
-  <w:num w:numId="7">
+  <w:num w:numId="17">
     <w:abstractNumId w:val="3"/>
   </w:num>
-  <w:num w:numId="8">
-    <w:abstractNumId w:val="1"/>
-  </w:num>
-  <w:num w:numId="9">
-    <w:abstractNumId w:val="2"/>
-  </w:num>
-  <w:num w:numId="10">
-    <w:abstractNumId w:val="10"/>
-  </w:num>
-  <w:num w:numId="11">
-    <w:abstractNumId w:val="4"/>
+  <w:num w:numId="18">
+    <w:abstractNumId w:val="11"/>
   </w:num>
 </w:numbering>
 </file>
@@ -6096,6 +6240,7 @@
   <w:style w:type="character" w:default="1" w:styleId="DefaultParagraphFont">
     <w:name w:val="Default Paragraph Font"/>
     <w:uiPriority w:val="1"/>
+    <w:semiHidden/>
     <w:unhideWhenUsed/>
   </w:style>
   <w:style w:type="table" w:default="1" w:styleId="TableNormal">
@@ -6271,6 +6416,40 @@
       <w:ind w:left="720"/>
       <w:contextualSpacing/>
     </w:pPr>
+  </w:style>
+  <w:style w:type="paragraph" w:styleId="BalloonText">
+    <w:name w:val="Balloon Text"/>
+    <w:basedOn w:val="Normal"/>
+    <w:link w:val="BalloonTextChar"/>
+    <w:uiPriority w:val="99"/>
+    <w:semiHidden/>
+    <w:unhideWhenUsed/>
+    <w:rsid w:val="00E15EA0"/>
+    <w:rPr>
+      <w:rFonts w:ascii="Times New Roman" w:hAnsi="Times New Roman" w:cs="Times New Roman"/>
+      <w:sz w:val="18"/>
+      <w:szCs w:val="18"/>
+    </w:rPr>
+  </w:style>
+  <w:style w:type="character" w:customStyle="1" w:styleId="BalloonTextChar">
+    <w:name w:val="Balloon Text Char"/>
+    <w:basedOn w:val="DefaultParagraphFont"/>
+    <w:link w:val="BalloonText"/>
+    <w:uiPriority w:val="99"/>
+    <w:semiHidden/>
+    <w:rsid w:val="00E15EA0"/>
+    <w:rPr>
+      <w:rFonts w:ascii="Times New Roman" w:hAnsi="Times New Roman" w:cs="Times New Roman"/>
+      <w:sz w:val="18"/>
+      <w:szCs w:val="18"/>
+    </w:rPr>
+  </w:style>
+  <w:style w:type="paragraph" w:styleId="Revision">
+    <w:name w:val="Revision"/>
+    <w:hidden/>
+    <w:uiPriority w:val="99"/>
+    <w:semiHidden/>
+    <w:rsid w:val="00E15EA0"/>
   </w:style>
 </w:styles>
 </file>
@@ -6541,7 +6720,7 @@
 </file>
 
 <file path=customXml/itemProps1.xml><?xml version="1.0" encoding="utf-8"?>
-<ds:datastoreItem xmlns:ds="http://schemas.openxmlformats.org/officeDocument/2006/customXml" ds:itemID="{4A0ADAAE-FF1A-BB4C-9ED3-4F26484FBCE6}">
+<ds:datastoreItem xmlns:ds="http://schemas.openxmlformats.org/officeDocument/2006/customXml" ds:itemID="{612A1DEE-AB05-D944-8D9D-C7E452E0F022}">
   <ds:schemaRefs>
     <ds:schemaRef ds:uri="http://schemas.openxmlformats.org/officeDocument/2006/bibliography"/>
   </ds:schemaRefs>

</xml_diff>